<commit_message>
Updated About me and CV
</commit_message>
<xml_diff>
--- a/assets/CV/RobinCR_Software_Developer.docx
+++ b/assets/CV/RobinCR_Software_Developer.docx
@@ -1,6 +1,6 @@
 
 <file path=word/document.xml><?xml version="1.0" encoding="utf-8"?>
-<w:document xmlns:wpc="http://schemas.microsoft.com/office/word/2010/wordprocessingCanvas" xmlns:cx="http://schemas.microsoft.com/office/drawing/2014/chartex" xmlns:cx1="http://schemas.microsoft.com/office/drawing/2015/9/8/chartex" xmlns:cx2="http://schemas.microsoft.com/office/drawing/2015/10/21/chartex" xmlns:cx3="http://schemas.microsoft.com/office/drawing/2016/5/9/chartex" xmlns:cx4="http://schemas.microsoft.com/office/drawing/2016/5/10/chartex" xmlns:cx5="http://schemas.microsoft.com/office/drawing/2016/5/11/chartex" xmlns:cx6="http://schemas.microsoft.com/office/drawing/2016/5/12/chartex" xmlns:cx7="http://schemas.microsoft.com/office/drawing/2016/5/13/chartex" xmlns:cx8="http://schemas.microsoft.com/office/drawing/2016/5/14/chartex" xmlns:mc="http://schemas.openxmlformats.org/markup-compatibility/2006" xmlns:aink="http://schemas.microsoft.com/office/drawing/2016/ink" xmlns:am3d="http://schemas.microsoft.com/office/drawing/2017/model3d" xmlns:o="urn:schemas-microsoft-com:office:office" xmlns:oel="http://schemas.microsoft.com/office/2019/extlst" xmlns:r="http://schemas.openxmlformats.org/officeDocument/2006/relationships" xmlns:m="http://schemas.openxmlformats.org/officeDocument/2006/math" xmlns:v="urn:schemas-microsoft-com:vml" xmlns:wp14="http://schemas.microsoft.com/office/word/2010/wordprocessingDrawing" xmlns:wp="http://schemas.openxmlformats.org/drawingml/2006/wordprocessingDrawing" xmlns:w10="urn:schemas-microsoft-com:office:word" xmlns:w="http://schemas.openxmlformats.org/wordprocessingml/2006/main" xmlns:w14="http://schemas.microsoft.com/office/word/2010/wordml" xmlns:w15="http://schemas.microsoft.com/office/word/2012/wordml" xmlns:w16cex="http://schemas.microsoft.com/office/word/2018/wordml/cex" xmlns:w16cid="http://schemas.microsoft.com/office/word/2016/wordml/cid" xmlns:w16="http://schemas.microsoft.com/office/word/2018/wordml" xmlns:w16du="http://schemas.microsoft.com/office/word/2023/wordml/word16du" xmlns:w16sdtdh="http://schemas.microsoft.com/office/word/2020/wordml/sdtdatahash" xmlns:w16se="http://schemas.microsoft.com/office/word/2015/wordml/symex" xmlns:wpg="http://schemas.microsoft.com/office/word/2010/wordprocessingGroup" xmlns:wpi="http://schemas.microsoft.com/office/word/2010/wordprocessingInk" xmlns:wne="http://schemas.microsoft.com/office/word/2006/wordml" xmlns:wps="http://schemas.microsoft.com/office/word/2010/wordprocessingShape" mc:Ignorable="w14 w15 w16se w16cid w16 w16cex w16sdtdh w16du wp14">
+<w:document xmlns:wpc="http://schemas.microsoft.com/office/word/2010/wordprocessingCanvas" xmlns:cx="http://schemas.microsoft.com/office/drawing/2014/chartex" xmlns:cx1="http://schemas.microsoft.com/office/drawing/2015/9/8/chartex" xmlns:cx2="http://schemas.microsoft.com/office/drawing/2015/10/21/chartex" xmlns:cx3="http://schemas.microsoft.com/office/drawing/2016/5/9/chartex" xmlns:cx4="http://schemas.microsoft.com/office/drawing/2016/5/10/chartex" xmlns:cx5="http://schemas.microsoft.com/office/drawing/2016/5/11/chartex" xmlns:cx6="http://schemas.microsoft.com/office/drawing/2016/5/12/chartex" xmlns:cx7="http://schemas.microsoft.com/office/drawing/2016/5/13/chartex" xmlns:cx8="http://schemas.microsoft.com/office/drawing/2016/5/14/chartex" xmlns:mc="http://schemas.openxmlformats.org/markup-compatibility/2006" xmlns:aink="http://schemas.microsoft.com/office/drawing/2016/ink" xmlns:am3d="http://schemas.microsoft.com/office/drawing/2017/model3d" xmlns:o="urn:schemas-microsoft-com:office:office" xmlns:oel="http://schemas.microsoft.com/office/2019/extlst" xmlns:r="http://schemas.openxmlformats.org/officeDocument/2006/relationships" xmlns:m="http://schemas.openxmlformats.org/officeDocument/2006/math" xmlns:v="urn:schemas-microsoft-com:vml" xmlns:wp14="http://schemas.microsoft.com/office/word/2010/wordprocessingDrawing" xmlns:wp="http://schemas.openxmlformats.org/drawingml/2006/wordprocessingDrawing" xmlns:w10="urn:schemas-microsoft-com:office:word" xmlns:w="http://schemas.openxmlformats.org/wordprocessingml/2006/main" xmlns:w14="http://schemas.microsoft.com/office/word/2010/wordml" xmlns:w15="http://schemas.microsoft.com/office/word/2012/wordml" xmlns:w16cex="http://schemas.microsoft.com/office/word/2018/wordml/cex" xmlns:w16cid="http://schemas.microsoft.com/office/word/2016/wordml/cid" xmlns:w16="http://schemas.microsoft.com/office/word/2018/wordml" xmlns:w16du="http://schemas.microsoft.com/office/word/2023/wordml/word16du" xmlns:w16sdtdh="http://schemas.microsoft.com/office/word/2020/wordml/sdtdatahash" xmlns:w16sdtfl="http://schemas.microsoft.com/office/word/2024/wordml/sdtformatlock" xmlns:w16se="http://schemas.microsoft.com/office/word/2015/wordml/symex" xmlns:wpg="http://schemas.microsoft.com/office/word/2010/wordprocessingGroup" xmlns:wpi="http://schemas.microsoft.com/office/word/2010/wordprocessingInk" xmlns:wne="http://schemas.microsoft.com/office/word/2006/wordml" xmlns:wps="http://schemas.microsoft.com/office/word/2010/wordprocessingShape" mc:Ignorable="w14 w15 w16se w16cid w16 w16cex w16sdtdh w16sdtfl w16du wp14">
   <w:body>
     <w:p>
       <w:pPr>
@@ -38,7 +38,15 @@
           <w:i/>
           <w:color w:val="999999"/>
         </w:rPr>
-        <w:t>Coimbatore,</w:t>
+        <w:t>Chennai</w:t>
+      </w:r>
+      <w:r>
+        <w:rPr>
+          <w:rFonts w:ascii="Roboto"/>
+          <w:i/>
+          <w:color w:val="999999"/>
+        </w:rPr>
+        <w:t>,</w:t>
       </w:r>
       <w:r>
         <w:rPr>
@@ -319,7 +327,29 @@
             <w:w w:val="105"/>
             <w:position w:val="2"/>
           </w:rPr>
-          <w:t>linkedin.com/in/robin-cr/</w:t>
+          <w:t>linkedin.com/in/robin-</w:t>
+        </w:r>
+        <w:proofErr w:type="spellStart"/>
+        <w:r>
+          <w:rPr>
+            <w:rStyle w:val="Hyperlink"/>
+            <w:rFonts w:ascii="Roboto"/>
+            <w:color w:val="auto"/>
+            <w:w w:val="105"/>
+            <w:position w:val="2"/>
+          </w:rPr>
+          <w:t>cr</w:t>
+        </w:r>
+        <w:proofErr w:type="spellEnd"/>
+        <w:r>
+          <w:rPr>
+            <w:rStyle w:val="Hyperlink"/>
+            <w:rFonts w:ascii="Roboto"/>
+            <w:color w:val="auto"/>
+            <w:w w:val="105"/>
+            <w:position w:val="2"/>
+          </w:rPr>
+          <w:t>/</w:t>
         </w:r>
       </w:hyperlink>
       <w:r>
@@ -512,7 +542,16 @@
           <w:sz w:val="20"/>
           <w:szCs w:val="20"/>
         </w:rPr>
-        <w:t>3+</w:t>
+        <w:t>4</w:t>
+      </w:r>
+      <w:r>
+        <w:rPr>
+          <w:color w:val="333333"/>
+          <w:w w:val="110"/>
+          <w:sz w:val="20"/>
+          <w:szCs w:val="20"/>
+        </w:rPr>
+        <w:t>+</w:t>
       </w:r>
       <w:r>
         <w:rPr>
@@ -892,18 +931,20 @@
           <w:w w:val="110"/>
           <w:szCs w:val="24"/>
         </w:rPr>
-        <w:t>Bosch</w:t>
-      </w:r>
+        <w:t>Automotive Robotics India (</w:t>
+      </w:r>
+      <w:proofErr w:type="spellStart"/>
+      <w:proofErr w:type="gramStart"/>
       <w:r>
         <w:rPr>
           <w:b/>
           <w:color w:val="414141"/>
-          <w:spacing w:val="-4"/>
-          <w:w w:val="110"/>
-          <w:szCs w:val="24"/>
-        </w:rPr>
-        <w:t xml:space="preserve"> </w:t>
-      </w:r>
+          <w:w w:val="110"/>
+          <w:szCs w:val="24"/>
+        </w:rPr>
+        <w:t>ARi</w:t>
+      </w:r>
+      <w:proofErr w:type="spellEnd"/>
       <w:r>
         <w:rPr>
           <w:b/>
@@ -911,36 +952,7 @@
           <w:w w:val="110"/>
           <w:szCs w:val="24"/>
         </w:rPr>
-        <w:t>Global</w:t>
-      </w:r>
-      <w:r>
-        <w:rPr>
-          <w:b/>
-          <w:color w:val="414141"/>
-          <w:spacing w:val="-4"/>
-          <w:w w:val="110"/>
-          <w:szCs w:val="24"/>
-        </w:rPr>
-        <w:t xml:space="preserve"> </w:t>
-      </w:r>
-      <w:r>
-        <w:rPr>
-          <w:b/>
-          <w:color w:val="414141"/>
-          <w:w w:val="110"/>
-          <w:szCs w:val="24"/>
-        </w:rPr>
-        <w:t>Software</w:t>
-      </w:r>
-      <w:r>
-        <w:rPr>
-          <w:b/>
-          <w:color w:val="414141"/>
-          <w:spacing w:val="-3"/>
-          <w:w w:val="110"/>
-          <w:szCs w:val="24"/>
-        </w:rPr>
-        <w:t xml:space="preserve"> </w:t>
+        <w:t>)</w:t>
       </w:r>
       <w:r>
         <w:rPr>
@@ -950,8 +962,9 @@
           <w:w w:val="110"/>
           <w:szCs w:val="24"/>
         </w:rPr>
-        <w:t>T</w:t>
-      </w:r>
+        <w:t xml:space="preserve">   </w:t>
+      </w:r>
+      <w:proofErr w:type="gramEnd"/>
       <w:r>
         <w:rPr>
           <w:b/>
@@ -960,7 +973,7 @@
           <w:w w:val="110"/>
           <w:szCs w:val="24"/>
         </w:rPr>
-        <w:t>echnologies</w:t>
+        <w:t xml:space="preserve">     </w:t>
       </w:r>
       <w:r>
         <w:rPr>
@@ -970,7 +983,7 @@
           <w:w w:val="110"/>
           <w:szCs w:val="24"/>
         </w:rPr>
-        <w:t xml:space="preserve">                                                            </w:t>
+        <w:t xml:space="preserve">                                                               </w:t>
       </w:r>
       <w:r>
         <w:rPr>
@@ -979,7 +992,25 @@
           <w:sz w:val="20"/>
           <w:szCs w:val="24"/>
         </w:rPr>
-        <w:t>Coimbatore, TamilNadu</w:t>
+        <w:t>C</w:t>
+      </w:r>
+      <w:r>
+        <w:rPr>
+          <w:i/>
+          <w:w w:val="105"/>
+          <w:sz w:val="20"/>
+          <w:szCs w:val="24"/>
+        </w:rPr>
+        <w:t>hennai</w:t>
+      </w:r>
+      <w:r>
+        <w:rPr>
+          <w:i/>
+          <w:w w:val="105"/>
+          <w:sz w:val="20"/>
+          <w:szCs w:val="24"/>
+        </w:rPr>
+        <w:t>, Tamil Nadu</w:t>
       </w:r>
     </w:p>
     <w:p>
@@ -991,6 +1022,9 @@
         <w:ind w:left="113"/>
         <w:rPr>
           <w:i/>
+          <w:color w:val="5D5D5D"/>
+          <w:spacing w:val="-2"/>
+          <w:w w:val="105"/>
           <w:sz w:val="18"/>
           <w:szCs w:val="24"/>
         </w:rPr>
@@ -1002,7 +1036,7 @@
           <w:sz w:val="20"/>
           <w:szCs w:val="24"/>
         </w:rPr>
-        <w:t>Embedded</w:t>
+        <w:t>Senior</w:t>
       </w:r>
       <w:r>
         <w:rPr>
@@ -1067,7 +1101,23 @@
           <w:sz w:val="20"/>
           <w:szCs w:val="24"/>
         </w:rPr>
-        <w:t xml:space="preserve">                                                                                      </w:t>
+        <w:t xml:space="preserve">                 </w:t>
+      </w:r>
+      <w:r>
+        <w:rPr>
+          <w:color w:val="5D5D5D"/>
+          <w:sz w:val="20"/>
+          <w:szCs w:val="24"/>
+        </w:rPr>
+        <w:t xml:space="preserve">             </w:t>
+      </w:r>
+      <w:r>
+        <w:rPr>
+          <w:color w:val="5D5D5D"/>
+          <w:sz w:val="20"/>
+          <w:szCs w:val="24"/>
+        </w:rPr>
+        <w:t xml:space="preserve">                                                             </w:t>
       </w:r>
       <w:r>
         <w:rPr>
@@ -1078,7 +1128,7 @@
           <w:sz w:val="18"/>
           <w:szCs w:val="24"/>
         </w:rPr>
-        <w:t>August</w:t>
+        <w:t>January</w:t>
       </w:r>
       <w:r>
         <w:rPr>
@@ -1100,7 +1150,18 @@
           <w:sz w:val="18"/>
           <w:szCs w:val="24"/>
         </w:rPr>
-        <w:t>2022</w:t>
+        <w:t>202</w:t>
+      </w:r>
+      <w:r>
+        <w:rPr>
+          <w:i/>
+          <w:color w:val="5D5D5D"/>
+          <w:spacing w:val="-2"/>
+          <w:w w:val="105"/>
+          <w:sz w:val="18"/>
+          <w:szCs w:val="24"/>
+        </w:rPr>
+        <w:t>5</w:t>
       </w:r>
       <w:r>
         <w:rPr>
@@ -1122,18 +1183,7 @@
           <w:sz w:val="18"/>
           <w:szCs w:val="24"/>
         </w:rPr>
-        <w:noBreakHyphen/>
-      </w:r>
-      <w:r>
-        <w:rPr>
-          <w:i/>
-          <w:color w:val="5D5D5D"/>
-          <w:spacing w:val="-4"/>
-          <w:w w:val="105"/>
-          <w:sz w:val="18"/>
-          <w:szCs w:val="24"/>
-        </w:rPr>
-        <w:t xml:space="preserve"> </w:t>
+        <w:t>–</w:t>
       </w:r>
       <w:r>
         <w:rPr>
@@ -1144,7 +1194,54 @@
           <w:sz w:val="18"/>
           <w:szCs w:val="24"/>
         </w:rPr>
-        <w:t>Present</w:t>
+        <w:t xml:space="preserve"> Present</w:t>
+      </w:r>
+    </w:p>
+    <w:p>
+      <w:pPr>
+        <w:tabs>
+          <w:tab w:val="left" w:pos="9132"/>
+        </w:tabs>
+        <w:spacing w:before="60"/>
+        <w:ind w:left="113"/>
+        <w:rPr>
+          <w:i/>
+          <w:color w:val="7F7F7F" w:themeColor="text1" w:themeTint="80"/>
+          <w:sz w:val="18"/>
+          <w:szCs w:val="24"/>
+        </w:rPr>
+      </w:pPr>
+      <w:r>
+        <w:rPr>
+          <w:rFonts w:ascii="Arial Rounded MT Bold" w:hAnsi="Arial Rounded MT Bold"/>
+          <w:b/>
+          <w:bCs/>
+          <w:color w:val="7F7F7F" w:themeColor="text1" w:themeTint="80"/>
+          <w:w w:val="110"/>
+          <w:sz w:val="20"/>
+          <w:szCs w:val="24"/>
+        </w:rPr>
+        <w:t>Client:</w:t>
+      </w:r>
+      <w:r>
+        <w:rPr>
+          <w:color w:val="7F7F7F" w:themeColor="text1" w:themeTint="80"/>
+          <w:w w:val="110"/>
+          <w:sz w:val="20"/>
+          <w:szCs w:val="24"/>
+        </w:rPr>
+        <w:t xml:space="preserve"> </w:t>
+      </w:r>
+      <w:r>
+        <w:rPr>
+          <w:b/>
+          <w:bCs/>
+          <w:color w:val="7F7F7F" w:themeColor="text1" w:themeTint="80"/>
+          <w:w w:val="110"/>
+          <w:sz w:val="20"/>
+          <w:szCs w:val="24"/>
+        </w:rPr>
+        <w:t>CATERPILLAR (Onsite)</w:t>
       </w:r>
     </w:p>
     <w:p>
@@ -1181,7 +1278,7 @@
           <w:sz w:val="20"/>
           <w:szCs w:val="24"/>
         </w:rPr>
-        <w:t>Interior Monitoring System (IMS) Project</w:t>
+        <w:t>LIDAR Perception for Surface Hauling truck</w:t>
       </w:r>
     </w:p>
     <w:p>
@@ -1193,7 +1290,10 @@
         </w:numPr>
       </w:pPr>
       <w:r>
-        <w:t>Developed algorithms for driver drowsiness module in C++ following design patterns and clean code.</w:t>
+        <w:t>Playback tool developer</w:t>
+      </w:r>
+      <w:r>
+        <w:t>.</w:t>
       </w:r>
     </w:p>
     <w:p>
@@ -1204,8 +1304,16 @@
           <w:numId w:val="9"/>
         </w:numPr>
       </w:pPr>
-      <w:r>
-        <w:t>Able to handle real world bugs which require proper strategies, Problem Solving and analytical skills.</w:t>
+      <w:proofErr w:type="spellStart"/>
+      <w:r>
+        <w:t>Rangeimage</w:t>
+      </w:r>
+      <w:proofErr w:type="spellEnd"/>
+      <w:r>
+        <w:t xml:space="preserve"> to point cloud converter for various lidars</w:t>
+      </w:r>
+      <w:r>
+        <w:t>.</w:t>
       </w:r>
     </w:p>
     <w:p>
@@ -1217,7 +1325,10 @@
         </w:numPr>
       </w:pPr>
       <w:r>
-        <w:t>Developed internal tools for simulating driver behaviors for debugging the issues without hardware.</w:t>
+        <w:t>Amenders for lidar logs</w:t>
+      </w:r>
+      <w:r>
+        <w:t>.</w:t>
       </w:r>
     </w:p>
     <w:p>
@@ -1229,7 +1340,10 @@
         </w:numPr>
       </w:pPr>
       <w:r>
-        <w:t>Integrated third-party libraries and APIs into C++ project.</w:t>
+        <w:t xml:space="preserve">Parsers for </w:t>
+      </w:r>
+      <w:r>
+        <w:t>ROS node communication.</w:t>
       </w:r>
     </w:p>
     <w:p>
@@ -1241,7 +1355,11 @@
         </w:numPr>
       </w:pPr>
       <w:r>
-        <w:t>A proper research and contributor for technical problems raised by client.</w:t>
+        <w:rPr>
+          <w:bCs/>
+          <w:szCs w:val="24"/>
+        </w:rPr>
+        <w:t>Developed APIs to work on multi-threaded application using modern C++.</w:t>
       </w:r>
     </w:p>
     <w:p>
@@ -1253,13 +1371,19 @@
         </w:numPr>
       </w:pPr>
       <w:r>
-        <w:t>Modules implementations such as interfaces, precondition handlers, error handlers</w:t>
-      </w:r>
-      <w:r>
-        <w:t xml:space="preserve">, schedulers </w:t>
-      </w:r>
-      <w:r>
-        <w:t xml:space="preserve">etc. </w:t>
+        <w:t xml:space="preserve">Integrated third-party </w:t>
+      </w:r>
+      <w:r>
+        <w:t>libraries</w:t>
+      </w:r>
+      <w:r>
+        <w:t xml:space="preserve"> (</w:t>
+      </w:r>
+      <w:r>
+        <w:t>Point Cloud)</w:t>
+      </w:r>
+      <w:r>
+        <w:t xml:space="preserve"> into C++ project.</w:t>
       </w:r>
     </w:p>
     <w:p>
@@ -1271,16 +1395,302 @@
         </w:numPr>
       </w:pPr>
       <w:r>
-        <w:t xml:space="preserve">Successfully addressed and resolved Level 8 and 9 QAC++ warnings in the codebase, adhering to </w:t>
-      </w:r>
-    </w:p>
-    <w:p>
-      <w:pPr>
-        <w:pStyle w:val="ListParagraph"/>
-        <w:ind w:left="846" w:firstLine="0"/>
-      </w:pPr>
-      <w:r>
-        <w:t>MISRA coding standards</w:t>
+        <w:rPr>
+          <w:bCs/>
+          <w:szCs w:val="24"/>
+        </w:rPr>
+        <w:t>Publisher and subscriber channels in ROS2 Noetic modules</w:t>
+      </w:r>
+      <w:r>
+        <w:rPr>
+          <w:bCs/>
+          <w:szCs w:val="24"/>
+        </w:rPr>
+        <w:t>.</w:t>
+      </w:r>
+    </w:p>
+    <w:p>
+      <w:pPr>
+        <w:tabs>
+          <w:tab w:val="left" w:pos="8864"/>
+        </w:tabs>
+        <w:spacing w:before="177"/>
+        <w:ind w:left="113"/>
+        <w:rPr>
+          <w:i/>
+          <w:sz w:val="20"/>
+          <w:szCs w:val="24"/>
+        </w:rPr>
+      </w:pPr>
+      <w:r>
+        <w:rPr>
+          <w:b/>
+          <w:color w:val="414141"/>
+          <w:w w:val="110"/>
+          <w:szCs w:val="24"/>
+        </w:rPr>
+        <w:t>Bosch</w:t>
+      </w:r>
+      <w:r>
+        <w:rPr>
+          <w:b/>
+          <w:color w:val="414141"/>
+          <w:spacing w:val="-4"/>
+          <w:w w:val="110"/>
+          <w:szCs w:val="24"/>
+        </w:rPr>
+        <w:t xml:space="preserve"> </w:t>
+      </w:r>
+      <w:r>
+        <w:rPr>
+          <w:b/>
+          <w:color w:val="414141"/>
+          <w:w w:val="110"/>
+          <w:szCs w:val="24"/>
+        </w:rPr>
+        <w:t>Global</w:t>
+      </w:r>
+      <w:r>
+        <w:rPr>
+          <w:b/>
+          <w:color w:val="414141"/>
+          <w:spacing w:val="-4"/>
+          <w:w w:val="110"/>
+          <w:szCs w:val="24"/>
+        </w:rPr>
+        <w:t xml:space="preserve"> </w:t>
+      </w:r>
+      <w:r>
+        <w:rPr>
+          <w:b/>
+          <w:color w:val="414141"/>
+          <w:w w:val="110"/>
+          <w:szCs w:val="24"/>
+        </w:rPr>
+        <w:t>Software</w:t>
+      </w:r>
+      <w:r>
+        <w:rPr>
+          <w:b/>
+          <w:color w:val="414141"/>
+          <w:spacing w:val="-3"/>
+          <w:w w:val="110"/>
+          <w:szCs w:val="24"/>
+        </w:rPr>
+        <w:t xml:space="preserve"> </w:t>
+      </w:r>
+      <w:r>
+        <w:rPr>
+          <w:b/>
+          <w:color w:val="414141"/>
+          <w:spacing w:val="-2"/>
+          <w:w w:val="110"/>
+          <w:szCs w:val="24"/>
+        </w:rPr>
+        <w:t>T</w:t>
+      </w:r>
+      <w:r>
+        <w:rPr>
+          <w:b/>
+          <w:color w:val="414141"/>
+          <w:spacing w:val="-2"/>
+          <w:w w:val="110"/>
+          <w:szCs w:val="24"/>
+        </w:rPr>
+        <w:t>echnologies</w:t>
+      </w:r>
+      <w:r>
+        <w:rPr>
+          <w:b/>
+          <w:color w:val="414141"/>
+          <w:spacing w:val="-2"/>
+          <w:w w:val="110"/>
+          <w:szCs w:val="24"/>
+        </w:rPr>
+        <w:t xml:space="preserve">                                                            </w:t>
+      </w:r>
+      <w:r>
+        <w:rPr>
+          <w:i/>
+          <w:w w:val="105"/>
+          <w:sz w:val="20"/>
+          <w:szCs w:val="24"/>
+        </w:rPr>
+        <w:t xml:space="preserve">Coimbatore, </w:t>
+      </w:r>
+      <w:r>
+        <w:rPr>
+          <w:i/>
+          <w:w w:val="105"/>
+          <w:sz w:val="20"/>
+          <w:szCs w:val="24"/>
+        </w:rPr>
+        <w:t>Tamil Nadu</w:t>
+      </w:r>
+    </w:p>
+    <w:p>
+      <w:pPr>
+        <w:tabs>
+          <w:tab w:val="left" w:pos="9132"/>
+        </w:tabs>
+        <w:spacing w:before="60"/>
+        <w:ind w:left="113"/>
+        <w:rPr>
+          <w:i/>
+          <w:sz w:val="18"/>
+          <w:szCs w:val="24"/>
+        </w:rPr>
+      </w:pPr>
+      <w:r>
+        <w:rPr>
+          <w:color w:val="5D5D5D"/>
+          <w:w w:val="110"/>
+          <w:sz w:val="20"/>
+          <w:szCs w:val="24"/>
+        </w:rPr>
+        <w:t>Embedded</w:t>
+      </w:r>
+      <w:r>
+        <w:rPr>
+          <w:color w:val="5D5D5D"/>
+          <w:spacing w:val="4"/>
+          <w:w w:val="110"/>
+          <w:sz w:val="20"/>
+          <w:szCs w:val="24"/>
+        </w:rPr>
+        <w:t xml:space="preserve"> </w:t>
+      </w:r>
+      <w:r>
+        <w:rPr>
+          <w:color w:val="5D5D5D"/>
+          <w:w w:val="110"/>
+          <w:sz w:val="20"/>
+          <w:szCs w:val="24"/>
+        </w:rPr>
+        <w:t>Software</w:t>
+      </w:r>
+      <w:r>
+        <w:rPr>
+          <w:color w:val="5D5D5D"/>
+          <w:spacing w:val="5"/>
+          <w:w w:val="110"/>
+          <w:sz w:val="20"/>
+          <w:szCs w:val="24"/>
+        </w:rPr>
+        <w:t xml:space="preserve"> </w:t>
+      </w:r>
+      <w:r>
+        <w:rPr>
+          <w:color w:val="5D5D5D"/>
+          <w:w w:val="110"/>
+          <w:sz w:val="20"/>
+          <w:szCs w:val="24"/>
+        </w:rPr>
+        <w:t>Engineer</w:t>
+      </w:r>
+      <w:r>
+        <w:rPr>
+          <w:color w:val="5D5D5D"/>
+          <w:spacing w:val="4"/>
+          <w:w w:val="110"/>
+          <w:sz w:val="20"/>
+          <w:szCs w:val="24"/>
+        </w:rPr>
+        <w:t xml:space="preserve"> </w:t>
+      </w:r>
+      <w:r>
+        <w:rPr>
+          <w:color w:val="5D5D5D"/>
+          <w:w w:val="110"/>
+          <w:sz w:val="20"/>
+          <w:szCs w:val="24"/>
+        </w:rPr>
+        <w:t xml:space="preserve">            </w:t>
+      </w:r>
+      <w:r>
+        <w:rPr>
+          <w:color w:val="5D5D5D"/>
+          <w:sz w:val="20"/>
+          <w:szCs w:val="24"/>
+        </w:rPr>
+        <w:t xml:space="preserve">                                                                            </w:t>
+      </w:r>
+      <w:r>
+        <w:rPr>
+          <w:i/>
+          <w:color w:val="5D5D5D"/>
+          <w:spacing w:val="-2"/>
+          <w:w w:val="105"/>
+          <w:sz w:val="18"/>
+          <w:szCs w:val="24"/>
+        </w:rPr>
+        <w:t>August</w:t>
+      </w:r>
+      <w:r>
+        <w:rPr>
+          <w:i/>
+          <w:color w:val="5D5D5D"/>
+          <w:spacing w:val="-4"/>
+          <w:w w:val="105"/>
+          <w:sz w:val="18"/>
+          <w:szCs w:val="24"/>
+        </w:rPr>
+        <w:t xml:space="preserve"> </w:t>
+      </w:r>
+      <w:r>
+        <w:rPr>
+          <w:i/>
+          <w:color w:val="5D5D5D"/>
+          <w:spacing w:val="-2"/>
+          <w:w w:val="105"/>
+          <w:sz w:val="18"/>
+          <w:szCs w:val="24"/>
+        </w:rPr>
+        <w:t>2022</w:t>
+      </w:r>
+      <w:r>
+        <w:rPr>
+          <w:i/>
+          <w:color w:val="5D5D5D"/>
+          <w:spacing w:val="-3"/>
+          <w:w w:val="105"/>
+          <w:sz w:val="18"/>
+          <w:szCs w:val="24"/>
+        </w:rPr>
+        <w:t xml:space="preserve"> </w:t>
+      </w:r>
+      <w:r>
+        <w:rPr>
+          <w:i/>
+          <w:color w:val="5D5D5D"/>
+          <w:spacing w:val="-2"/>
+          <w:w w:val="105"/>
+          <w:sz w:val="18"/>
+          <w:szCs w:val="24"/>
+        </w:rPr>
+        <w:t>–</w:t>
+      </w:r>
+      <w:r>
+        <w:rPr>
+          <w:i/>
+          <w:color w:val="5D5D5D"/>
+          <w:spacing w:val="-4"/>
+          <w:w w:val="105"/>
+          <w:sz w:val="18"/>
+          <w:szCs w:val="24"/>
+        </w:rPr>
+        <w:t xml:space="preserve"> </w:t>
+      </w:r>
+      <w:r>
+        <w:rPr>
+          <w:i/>
+          <w:color w:val="5D5D5D"/>
+          <w:spacing w:val="-2"/>
+          <w:w w:val="105"/>
+          <w:sz w:val="18"/>
+          <w:szCs w:val="24"/>
+        </w:rPr>
+        <w:t>December 2024</w:t>
       </w:r>
     </w:p>
     <w:p>
@@ -1307,7 +1717,107 @@
           <w:sz w:val="20"/>
           <w:szCs w:val="24"/>
         </w:rPr>
-        <w:t> </w:t>
+        <w:t xml:space="preserve">  </w:t>
+      </w:r>
+      <w:r>
+        <w:rPr>
+          <w:b/>
+          <w:bCs/>
+          <w:color w:val="000000"/>
+          <w:sz w:val="20"/>
+          <w:szCs w:val="24"/>
+        </w:rPr>
+        <w:t>Interior Monitoring System (IMS) Project</w:t>
+      </w:r>
+    </w:p>
+    <w:p>
+      <w:pPr>
+        <w:pStyle w:val="ListParagraph"/>
+        <w:numPr>
+          <w:ilvl w:val="0"/>
+          <w:numId w:val="9"/>
+        </w:numPr>
+      </w:pPr>
+      <w:r>
+        <w:t>Developed algorithms for driver drowsiness module in C++ following design patterns and clean code.</w:t>
+      </w:r>
+    </w:p>
+    <w:p>
+      <w:pPr>
+        <w:pStyle w:val="ListParagraph"/>
+        <w:numPr>
+          <w:ilvl w:val="0"/>
+          <w:numId w:val="9"/>
+        </w:numPr>
+      </w:pPr>
+      <w:r>
+        <w:t>Able to handle real world bugs which require proper strategies, Problem Solving and analytical skills.</w:t>
+      </w:r>
+    </w:p>
+    <w:p>
+      <w:pPr>
+        <w:pStyle w:val="ListParagraph"/>
+        <w:numPr>
+          <w:ilvl w:val="0"/>
+          <w:numId w:val="9"/>
+        </w:numPr>
+      </w:pPr>
+      <w:r>
+        <w:t>Developed internal tools for simulating driver behaviors for debugging the issues without hardware.</w:t>
+      </w:r>
+    </w:p>
+    <w:p>
+      <w:pPr>
+        <w:pStyle w:val="ListParagraph"/>
+        <w:numPr>
+          <w:ilvl w:val="0"/>
+          <w:numId w:val="9"/>
+        </w:numPr>
+      </w:pPr>
+      <w:r>
+        <w:t>A proper research and contributor for technical problems raised by client.</w:t>
+      </w:r>
+    </w:p>
+    <w:p>
+      <w:pPr>
+        <w:pStyle w:val="ListParagraph"/>
+        <w:numPr>
+          <w:ilvl w:val="0"/>
+          <w:numId w:val="9"/>
+        </w:numPr>
+      </w:pPr>
+      <w:r>
+        <w:t>Modules implementations such as interfaces, precondition handlers, error handlers</w:t>
+      </w:r>
+      <w:r>
+        <w:t xml:space="preserve">, schedulers </w:t>
+      </w:r>
+      <w:r>
+        <w:t xml:space="preserve">etc. </w:t>
+      </w:r>
+    </w:p>
+    <w:p>
+      <w:pPr>
+        <w:pStyle w:val="ListParagraph"/>
+        <w:numPr>
+          <w:ilvl w:val="0"/>
+          <w:numId w:val="9"/>
+        </w:numPr>
+      </w:pPr>
+      <w:r>
+        <w:t xml:space="preserve">Successfully addressed and resolved Level 8 and 9 QAC++ warnings in the codebase, adhering to </w:t>
+      </w:r>
+    </w:p>
+    <w:p>
+      <w:pPr>
+        <w:pStyle w:val="ListParagraph"/>
+        <w:ind w:left="846" w:firstLine="0"/>
+      </w:pPr>
+      <w:r>
+        <w:t>MISRA coding standards</w:t>
+      </w:r>
+      <w:r>
+        <w:t>.</w:t>
       </w:r>
     </w:p>
     <w:p>
@@ -1334,6 +1844,33 @@
           <w:sz w:val="20"/>
           <w:szCs w:val="24"/>
         </w:rPr>
+        <w:t> </w:t>
+      </w:r>
+    </w:p>
+    <w:p>
+      <w:pPr>
+        <w:pBdr>
+          <w:top w:val="none" w:sz="4" w:space="0" w:color="auto"/>
+          <w:left w:val="none" w:sz="4" w:space="0" w:color="auto"/>
+          <w:bottom w:val="none" w:sz="4" w:space="0" w:color="auto"/>
+          <w:right w:val="none" w:sz="4" w:space="0" w:color="auto"/>
+          <w:between w:val="none" w:sz="4" w:space="0" w:color="auto"/>
+          <w:bar w:val="none" w:sz="4" w:color="auto"/>
+        </w:pBdr>
+        <w:rPr>
+          <w:color w:val="000000"/>
+          <w:sz w:val="20"/>
+          <w:szCs w:val="24"/>
+        </w:rPr>
+      </w:pPr>
+      <w:r>
+        <w:rPr>
+          <w:b/>
+          <w:bCs/>
+          <w:color w:val="000000"/>
+          <w:sz w:val="20"/>
+          <w:szCs w:val="24"/>
+        </w:rPr>
         <w:t xml:space="preserve">  </w:t>
       </w:r>
       <w:r>
@@ -1407,7 +1944,10 @@
         </w:numPr>
       </w:pPr>
       <w:r>
-        <w:t>Engineered the CAN signals for the proper usage in sub modules.</w:t>
+        <w:t xml:space="preserve">Writing unit tests and performing testing to ensure software </w:t>
+      </w:r>
+      <w:r>
+        <w:t>functionality.</w:t>
       </w:r>
     </w:p>
     <w:p>
@@ -1419,10 +1959,7 @@
         </w:numPr>
       </w:pPr>
       <w:r>
-        <w:t xml:space="preserve">Writing unit tests and performing testing to ensure software </w:t>
-      </w:r>
-      <w:r>
-        <w:t>functionality.</w:t>
+        <w:t xml:space="preserve">Implemented an algorithm that will modify the fixed parameters in RTE layer into a configurable in application layer. </w:t>
       </w:r>
     </w:p>
     <w:p>
@@ -1434,7 +1971,7 @@
         </w:numPr>
       </w:pPr>
       <w:r>
-        <w:t xml:space="preserve">Implemented an algorithm that will modify the fixed parameters in RTE layer into a configurable in application layer. </w:t>
+        <w:t>Base level knowledge on Diagnostics, Bootloader and RTE layer is gained.</w:t>
       </w:r>
     </w:p>
     <w:p>
@@ -1445,32 +1982,13 @@
           <w:numId w:val="10"/>
         </w:numPr>
       </w:pPr>
-      <w:r>
-        <w:t>Worked for the ASPICE related standards followed in AUTOSAR projects.</w:t>
-      </w:r>
-    </w:p>
-    <w:p>
-      <w:pPr>
-        <w:pStyle w:val="ListParagraph"/>
-        <w:numPr>
-          <w:ilvl w:val="0"/>
-          <w:numId w:val="10"/>
-        </w:numPr>
-      </w:pPr>
-      <w:r>
-        <w:t>Base level knowledge on Diagnostics, Bootloader and RTE layer is gained.</w:t>
-      </w:r>
-    </w:p>
-    <w:p>
-      <w:pPr>
-        <w:pStyle w:val="ListParagraph"/>
-        <w:numPr>
-          <w:ilvl w:val="0"/>
-          <w:numId w:val="10"/>
-        </w:numPr>
-      </w:pPr>
-      <w:r>
-        <w:t>Cmake integration to the modules.</w:t>
+      <w:proofErr w:type="spellStart"/>
+      <w:r>
+        <w:t>Cmake</w:t>
+      </w:r>
+      <w:proofErr w:type="spellEnd"/>
+      <w:r>
+        <w:t xml:space="preserve"> integration to the modules.</w:t>
       </w:r>
     </w:p>
     <w:p>
@@ -1495,6 +2013,7 @@
         </w:rPr>
         <w:t xml:space="preserve">  </w:t>
       </w:r>
+      <w:proofErr w:type="spellStart"/>
       <w:r>
         <w:rPr>
           <w:b/>
@@ -1503,7 +2022,18 @@
           <w:w w:val="115"/>
           <w:szCs w:val="24"/>
         </w:rPr>
-        <w:t>Gadgeon Systems Pvt</w:t>
+        <w:t>Gadgeon</w:t>
+      </w:r>
+      <w:proofErr w:type="spellEnd"/>
+      <w:r>
+        <w:rPr>
+          <w:b/>
+          <w:color w:val="414141"/>
+          <w:spacing w:val="-2"/>
+          <w:w w:val="115"/>
+          <w:szCs w:val="24"/>
+        </w:rPr>
+        <w:t xml:space="preserve"> Systems Pvt</w:t>
       </w:r>
       <w:r>
         <w:rPr>
@@ -1525,6 +2055,7 @@
         </w:rPr>
         <w:t>Ltd</w:t>
       </w:r>
+      <w:proofErr w:type="gramStart"/>
       <w:r>
         <w:rPr>
           <w:b/>
@@ -1541,7 +2072,17 @@
           <w:sz w:val="20"/>
           <w:szCs w:val="24"/>
         </w:rPr>
-        <w:t>Kochi,</w:t>
+        <w:t>Kochi</w:t>
+      </w:r>
+      <w:proofErr w:type="gramEnd"/>
+      <w:r>
+        <w:rPr>
+          <w:i/>
+          <w:w w:val="105"/>
+          <w:sz w:val="20"/>
+          <w:szCs w:val="24"/>
+        </w:rPr>
+        <w:t>,</w:t>
       </w:r>
       <w:r>
         <w:rPr>
@@ -1668,7 +2209,17 @@
           <w:sz w:val="18"/>
           <w:szCs w:val="24"/>
         </w:rPr>
-        <w:t xml:space="preserve"> August</w:t>
+        <w:t xml:space="preserve"> </w:t>
+      </w:r>
+      <w:proofErr w:type="gramStart"/>
+      <w:r>
+        <w:rPr>
+          <w:i/>
+          <w:color w:val="5D5D5D"/>
+          <w:sz w:val="18"/>
+          <w:szCs w:val="24"/>
+        </w:rPr>
+        <w:t>August</w:t>
       </w:r>
       <w:r>
         <w:rPr>
@@ -1700,6 +2251,7 @@
         </w:rPr>
         <w:t>2022</w:t>
       </w:r>
+      <w:proofErr w:type="gramEnd"/>
     </w:p>
     <w:p>
       <w:pPr>
@@ -1773,22 +2325,6 @@
     </w:p>
     <w:p>
       <w:pPr>
-        <w:pStyle w:val="ListParagraph"/>
-        <w:numPr>
-          <w:ilvl w:val="0"/>
-          <w:numId w:val="7"/>
-        </w:numPr>
-      </w:pPr>
-      <w:r>
-        <w:rPr>
-          <w:bCs/>
-          <w:szCs w:val="24"/>
-        </w:rPr>
-        <w:t>Developed APIs to work on multi-threaded application using modern C++.</w:t>
-      </w:r>
-    </w:p>
-    <w:p>
-      <w:pPr>
         <w:pStyle w:val="Heading1"/>
         <w:tabs>
           <w:tab w:val="left" w:pos="10462"/>
@@ -1806,6 +2342,30 @@
         </w:tabs>
         <w:ind w:left="0"/>
         <w:rPr>
+          <w:w w:val="115"/>
+        </w:rPr>
+      </w:pPr>
+    </w:p>
+    <w:p>
+      <w:pPr>
+        <w:pStyle w:val="Heading1"/>
+        <w:tabs>
+          <w:tab w:val="left" w:pos="10462"/>
+        </w:tabs>
+        <w:ind w:left="0"/>
+        <w:rPr>
+          <w:w w:val="115"/>
+        </w:rPr>
+      </w:pPr>
+    </w:p>
+    <w:p>
+      <w:pPr>
+        <w:pStyle w:val="Heading1"/>
+        <w:tabs>
+          <w:tab w:val="left" w:pos="10462"/>
+        </w:tabs>
+        <w:ind w:left="0"/>
+        <w:rPr>
           <w:rFonts w:ascii="Times New Roman"/>
           <w:b w:val="0"/>
         </w:rPr>
@@ -1814,6 +2374,7 @@
         <w:rPr>
           <w:w w:val="115"/>
         </w:rPr>
+        <w:lastRenderedPageBreak/>
         <w:t xml:space="preserve"> Pro</w:t>
       </w:r>
       <w:r>
@@ -1839,185 +2400,6 @@
           <w:u w:val="single" w:color="5D5D5D"/>
         </w:rPr>
         <w:tab/>
-      </w:r>
-    </w:p>
-    <w:p>
-      <w:pPr>
-        <w:pStyle w:val="Heading2"/>
-        <w:tabs>
-          <w:tab w:val="left" w:pos="10004"/>
-        </w:tabs>
-        <w:spacing w:before="181"/>
-        <w:rPr>
-          <w:b w:val="0"/>
-          <w:i/>
-          <w:sz w:val="18"/>
-        </w:rPr>
-      </w:pPr>
-      <w:r>
-        <w:rPr>
-          <w:color w:val="414141"/>
-          <w:w w:val="110"/>
-        </w:rPr>
-        <w:t>Driver</w:t>
-      </w:r>
-      <w:r>
-        <w:rPr>
-          <w:color w:val="414141"/>
-          <w:spacing w:val="10"/>
-          <w:w w:val="110"/>
-        </w:rPr>
-        <w:t xml:space="preserve"> </w:t>
-      </w:r>
-      <w:r>
-        <w:rPr>
-          <w:color w:val="414141"/>
-          <w:w w:val="110"/>
-        </w:rPr>
-        <w:t>Drowsiness</w:t>
-      </w:r>
-      <w:r>
-        <w:rPr>
-          <w:color w:val="414141"/>
-          <w:spacing w:val="10"/>
-          <w:w w:val="110"/>
-        </w:rPr>
-        <w:t xml:space="preserve"> </w:t>
-      </w:r>
-      <w:r>
-        <w:rPr>
-          <w:color w:val="414141"/>
-          <w:w w:val="110"/>
-        </w:rPr>
-        <w:t>Calculation</w:t>
-      </w:r>
-      <w:r>
-        <w:rPr>
-          <w:color w:val="414141"/>
-          <w:spacing w:val="10"/>
-          <w:w w:val="110"/>
-        </w:rPr>
-        <w:t xml:space="preserve"> </w:t>
-      </w:r>
-      <w:r>
-        <w:rPr>
-          <w:color w:val="414141"/>
-          <w:w w:val="110"/>
-        </w:rPr>
-        <w:t>in</w:t>
-      </w:r>
-      <w:r>
-        <w:rPr>
-          <w:color w:val="414141"/>
-          <w:spacing w:val="10"/>
-          <w:w w:val="110"/>
-        </w:rPr>
-        <w:t xml:space="preserve"> </w:t>
-      </w:r>
-      <w:r>
-        <w:rPr>
-          <w:color w:val="414141"/>
-          <w:w w:val="110"/>
-        </w:rPr>
-        <w:t>Driver</w:t>
-      </w:r>
-      <w:r>
-        <w:rPr>
-          <w:color w:val="414141"/>
-          <w:spacing w:val="10"/>
-          <w:w w:val="110"/>
-        </w:rPr>
-        <w:t xml:space="preserve"> </w:t>
-      </w:r>
-      <w:r>
-        <w:rPr>
-          <w:color w:val="414141"/>
-          <w:w w:val="110"/>
-        </w:rPr>
-        <w:t>Monitoring</w:t>
-      </w:r>
-      <w:r>
-        <w:rPr>
-          <w:color w:val="414141"/>
-          <w:spacing w:val="10"/>
-          <w:w w:val="110"/>
-        </w:rPr>
-        <w:t xml:space="preserve"> </w:t>
-      </w:r>
-      <w:r>
-        <w:rPr>
-          <w:color w:val="414141"/>
-          <w:spacing w:val="-2"/>
-          <w:w w:val="110"/>
-        </w:rPr>
-        <w:t>System</w:t>
-      </w:r>
-      <w:r>
-        <w:rPr>
-          <w:color w:val="414141"/>
-        </w:rPr>
-        <w:tab/>
-      </w:r>
-      <w:r>
-        <w:rPr>
-          <w:b w:val="0"/>
-          <w:i/>
-          <w:spacing w:val="-2"/>
-          <w:w w:val="115"/>
-          <w:sz w:val="18"/>
-        </w:rPr>
-        <w:t>Bosch</w:t>
-      </w:r>
-    </w:p>
-    <w:p>
-      <w:pPr>
-        <w:pStyle w:val="ListParagraph"/>
-        <w:numPr>
-          <w:ilvl w:val="0"/>
-          <w:numId w:val="7"/>
-        </w:numPr>
-      </w:pPr>
-      <w:r>
-        <w:t xml:space="preserve">Contributed to the development of </w:t>
-      </w:r>
-      <w:r>
-        <w:t xml:space="preserve">drowsiness detection algorithms </w:t>
-      </w:r>
-      <w:r>
-        <w:t>in C++.</w:t>
-      </w:r>
-    </w:p>
-    <w:p>
-      <w:pPr>
-        <w:pStyle w:val="ListParagraph"/>
-        <w:numPr>
-          <w:ilvl w:val="0"/>
-          <w:numId w:val="7"/>
-        </w:numPr>
-      </w:pPr>
-      <w:r>
-        <w:t>Developed a library for v</w:t>
-      </w:r>
-      <w:r>
-        <w:t xml:space="preserve">ector calculations </w:t>
-      </w:r>
-      <w:r>
-        <w:t>on</w:t>
-      </w:r>
-      <w:r>
-        <w:t xml:space="preserve"> head and eye movements.</w:t>
-      </w:r>
-    </w:p>
-    <w:p>
-      <w:pPr>
-        <w:pStyle w:val="ListParagraph"/>
-        <w:numPr>
-          <w:ilvl w:val="0"/>
-          <w:numId w:val="7"/>
-        </w:numPr>
-      </w:pPr>
-      <w:r>
-        <w:t>Utilized feature engineering methods to Preprocess and transform the camera signal data.</w:t>
       </w:r>
     </w:p>
     <w:bookmarkStart w:id="0" w:name="_Hlk181736295"/>
@@ -2150,7 +2532,6 @@
         <w:rPr>
           <w:w w:val="110"/>
         </w:rPr>
-        <w:lastRenderedPageBreak/>
         <w:t>Ski</w:t>
       </w:r>
       <w:r>
@@ -2426,8 +2807,17 @@
           <w:color w:val="000000"/>
           <w:szCs w:val="26"/>
         </w:rPr>
-        <w:t>, PlantUML, MATLAB</w:t>
-      </w:r>
+        <w:t xml:space="preserve">, </w:t>
+      </w:r>
+      <w:proofErr w:type="spellStart"/>
+      <w:r>
+        <w:rPr>
+          <w:color w:val="000000"/>
+          <w:szCs w:val="26"/>
+        </w:rPr>
+        <w:t>PlantUML</w:t>
+      </w:r>
+      <w:proofErr w:type="spellEnd"/>
     </w:p>
     <w:p>
       <w:pPr>
@@ -2463,7 +2853,30 @@
           <w:color w:val="000000"/>
           <w:szCs w:val="26"/>
         </w:rPr>
-        <w:t>: Green Hills MULTI, Lauterbach Trace32</w:t>
+        <w:t xml:space="preserve">: </w:t>
+      </w:r>
+      <w:proofErr w:type="spellStart"/>
+      <w:r>
+        <w:rPr>
+          <w:color w:val="000000"/>
+          <w:szCs w:val="26"/>
+        </w:rPr>
+        <w:t>Valgrind</w:t>
+      </w:r>
+      <w:proofErr w:type="spellEnd"/>
+      <w:r>
+        <w:rPr>
+          <w:color w:val="000000"/>
+          <w:szCs w:val="26"/>
+        </w:rPr>
+        <w:t xml:space="preserve">, GDB, </w:t>
+      </w:r>
+      <w:r>
+        <w:rPr>
+          <w:color w:val="000000"/>
+          <w:szCs w:val="26"/>
+        </w:rPr>
+        <w:t>Lauterbach Trace32</w:t>
       </w:r>
     </w:p>
     <w:p>
@@ -2500,8 +2913,17 @@
           <w:color w:val="000000"/>
           <w:szCs w:val="26"/>
         </w:rPr>
-        <w:t>: CANoe</w:t>
-      </w:r>
+        <w:t xml:space="preserve">: </w:t>
+      </w:r>
+      <w:proofErr w:type="spellStart"/>
+      <w:r>
+        <w:rPr>
+          <w:color w:val="000000"/>
+          <w:szCs w:val="26"/>
+        </w:rPr>
+        <w:t>CANoe</w:t>
+      </w:r>
+      <w:proofErr w:type="spellEnd"/>
     </w:p>
     <w:p>
       <w:pPr>
@@ -2581,44 +3003,30 @@
           <w:color w:val="000000"/>
           <w:szCs w:val="26"/>
         </w:rPr>
-        <w:t>: Gtest, Excel UT automation</w:t>
-      </w:r>
-    </w:p>
-    <w:p>
-      <w:pPr>
-        <w:pStyle w:val="ListParagraph"/>
-        <w:numPr>
-          <w:ilvl w:val="0"/>
-          <w:numId w:val="12"/>
-        </w:numPr>
-        <w:pBdr>
-          <w:top w:val="none" w:sz="4" w:space="0" w:color="auto"/>
-          <w:left w:val="none" w:sz="4" w:space="0" w:color="auto"/>
-          <w:bottom w:val="none" w:sz="4" w:space="0" w:color="auto"/>
-          <w:right w:val="none" w:sz="4" w:space="0" w:color="auto"/>
-          <w:between w:val="none" w:sz="4" w:space="0" w:color="auto"/>
-          <w:bar w:val="none" w:sz="4" w:color="auto"/>
-        </w:pBdr>
+        <w:t xml:space="preserve">: </w:t>
+      </w:r>
+      <w:proofErr w:type="spellStart"/>
+      <w:r>
         <w:rPr>
           <w:color w:val="000000"/>
           <w:szCs w:val="26"/>
         </w:rPr>
-      </w:pPr>
-      <w:r>
-        <w:rPr>
-          <w:b/>
-          <w:color w:val="000000"/>
-          <w:sz w:val="24"/>
-          <w:szCs w:val="26"/>
-        </w:rPr>
-        <w:t>Simulation and Debugging</w:t>
-      </w:r>
+        <w:t>Gtest</w:t>
+      </w:r>
+      <w:proofErr w:type="spellEnd"/>
       <w:r>
         <w:rPr>
           <w:color w:val="000000"/>
           <w:szCs w:val="26"/>
         </w:rPr>
-        <w:t>: Logic Analyzer, DSO</w:t>
+        <w:t>, Excel UT automation</w:t>
+      </w:r>
+      <w:r>
+        <w:rPr>
+          <w:color w:val="000000"/>
+          <w:szCs w:val="26"/>
+        </w:rPr>
+        <w:t>, BOOST</w:t>
       </w:r>
     </w:p>
     <w:p>
@@ -2662,8 +3070,18 @@
           <w:sz w:val="22"/>
           <w:szCs w:val="22"/>
         </w:rPr>
-        <w:t>, BitBucket</w:t>
-      </w:r>
+        <w:t xml:space="preserve">, </w:t>
+      </w:r>
+      <w:proofErr w:type="spellStart"/>
+      <w:r>
+        <w:rPr>
+          <w:color w:val="000000"/>
+          <w:sz w:val="22"/>
+          <w:szCs w:val="22"/>
+        </w:rPr>
+        <w:t>BitBucket</w:t>
+      </w:r>
+      <w:proofErr w:type="spellEnd"/>
     </w:p>
     <w:p>
       <w:pPr>
@@ -2706,50 +3124,8 @@
           <w:sz w:val="22"/>
           <w:szCs w:val="22"/>
         </w:rPr>
-        <w:t xml:space="preserve"> QNX, Apertis, Ubuntu</w:t>
-      </w:r>
-    </w:p>
-    <w:p>
-      <w:pPr>
-        <w:pStyle w:val="BodyText"/>
-        <w:numPr>
-          <w:ilvl w:val="0"/>
-          <w:numId w:val="12"/>
-        </w:numPr>
-        <w:tabs>
-          <w:tab w:val="left" w:pos="2462"/>
-        </w:tabs>
-        <w:spacing w:before="71" w:line="184" w:lineRule="auto"/>
-        <w:ind w:right="1"/>
-        <w:rPr>
-          <w:color w:val="000000"/>
-          <w:sz w:val="22"/>
-          <w:szCs w:val="22"/>
-        </w:rPr>
-      </w:pPr>
-      <w:r>
-        <w:rPr>
-          <w:b/>
-          <w:color w:val="000000"/>
-          <w:sz w:val="24"/>
-          <w:szCs w:val="22"/>
-        </w:rPr>
-        <w:t>AI / Machine Learning</w:t>
-      </w:r>
-      <w:r>
-        <w:rPr>
-          <w:color w:val="000000"/>
-          <w:sz w:val="22"/>
-          <w:szCs w:val="22"/>
-        </w:rPr>
-        <w:t>: CNN, Data preprocessing, Classification, Detection</w:t>
-      </w:r>
-    </w:p>
-    <w:p>
-      <w:pPr>
-        <w:pStyle w:val="ListParagraph"/>
-        <w:ind w:left="720" w:firstLine="0"/>
-      </w:pPr>
+        <w:t xml:space="preserve"> Ubuntu</w:t>
+      </w:r>
     </w:p>
     <w:p/>
     <w:p>
@@ -2924,38 +3300,34 @@
         <w:pStyle w:val="ListParagraph"/>
         <w:spacing w:line="276" w:lineRule="auto"/>
         <w:ind w:left="833" w:firstLine="0"/>
+      </w:pPr>
+      <w:r>
         <w:rPr>
           <w:color w:val="414141"/>
           <w:w w:val="110"/>
         </w:rPr>
-      </w:pPr>
+        <w:t>Move Semantics,</w:t>
+      </w:r>
       <w:r>
         <w:rPr>
           <w:color w:val="414141"/>
           <w:w w:val="110"/>
         </w:rPr>
-        <w:t>OOPs, SOLID principles, Design Patterns, Multi-threading</w:t>
+        <w:t xml:space="preserve"> </w:t>
       </w:r>
       <w:r>
         <w:rPr>
           <w:color w:val="414141"/>
           <w:w w:val="110"/>
         </w:rPr>
-        <w:t xml:space="preserve">, Move Semantics, </w:t>
-      </w:r>
-    </w:p>
-    <w:p>
-      <w:pPr>
-        <w:pStyle w:val="ListParagraph"/>
-        <w:spacing w:line="276" w:lineRule="auto"/>
-        <w:ind w:left="833" w:firstLine="0"/>
-      </w:pPr>
+        <w:t>Smart Pointers</w:t>
+      </w:r>
       <w:r>
         <w:rPr>
           <w:color w:val="414141"/>
           <w:w w:val="110"/>
         </w:rPr>
-        <w:t>Smart Pointers</w:t>
+        <w:t>, Templates, Functional Programming, Atomics</w:t>
       </w:r>
       <w:r>
         <w:rPr>
@@ -2969,467 +3341,6 @@
     <w:p>
       <w:r>
         <w:tab/>
-      </w:r>
-    </w:p>
-    <w:p>
-      <w:pPr>
-        <w:ind w:firstLine="126"/>
-        <w:rPr>
-          <w:rFonts w:ascii="Times New Roman"/>
-          <w:b/>
-          <w:sz w:val="32"/>
-        </w:rPr>
-      </w:pPr>
-      <w:r>
-        <w:rPr>
-          <w:b/>
-          <w:w w:val="110"/>
-          <w:sz w:val="32"/>
-        </w:rPr>
-        <w:t>Ach</w:t>
-      </w:r>
-      <w:r>
-        <w:rPr>
-          <w:b/>
-          <w:color w:val="333333"/>
-          <w:w w:val="110"/>
-          <w:sz w:val="32"/>
-        </w:rPr>
-        <w:t>ievements</w:t>
-      </w:r>
-      <w:r>
-        <w:rPr>
-          <w:b/>
-          <w:color w:val="333333"/>
-          <w:spacing w:val="-35"/>
-          <w:w w:val="110"/>
-          <w:sz w:val="32"/>
-        </w:rPr>
-        <w:t xml:space="preserve"> </w:t>
-      </w:r>
-      <w:r>
-        <w:rPr>
-          <w:rFonts w:ascii="Times New Roman"/>
-          <w:color w:val="333333"/>
-          <w:u w:val="single" w:color="5D5D5D"/>
-        </w:rPr>
-        <w:tab/>
-      </w:r>
-      <w:r>
-        <w:rPr>
-          <w:rFonts w:ascii="Times New Roman"/>
-          <w:color w:val="333333"/>
-          <w:u w:val="single" w:color="5D5D5D"/>
-        </w:rPr>
-        <w:tab/>
-      </w:r>
-      <w:r>
-        <w:rPr>
-          <w:rFonts w:ascii="Times New Roman"/>
-          <w:color w:val="333333"/>
-          <w:u w:val="single" w:color="5D5D5D"/>
-        </w:rPr>
-        <w:tab/>
-      </w:r>
-      <w:r>
-        <w:rPr>
-          <w:rFonts w:ascii="Times New Roman"/>
-          <w:color w:val="333333"/>
-          <w:u w:val="single" w:color="5D5D5D"/>
-        </w:rPr>
-        <w:tab/>
-      </w:r>
-      <w:r>
-        <w:rPr>
-          <w:rFonts w:ascii="Times New Roman"/>
-          <w:color w:val="333333"/>
-          <w:u w:val="single" w:color="5D5D5D"/>
-        </w:rPr>
-        <w:tab/>
-      </w:r>
-      <w:r>
-        <w:rPr>
-          <w:rFonts w:ascii="Times New Roman"/>
-          <w:color w:val="333333"/>
-          <w:u w:val="single" w:color="5D5D5D"/>
-        </w:rPr>
-        <w:tab/>
-      </w:r>
-      <w:r>
-        <w:rPr>
-          <w:rFonts w:ascii="Times New Roman"/>
-          <w:color w:val="333333"/>
-          <w:u w:val="single" w:color="5D5D5D"/>
-        </w:rPr>
-        <w:tab/>
-      </w:r>
-      <w:r>
-        <w:rPr>
-          <w:rFonts w:ascii="Times New Roman"/>
-          <w:color w:val="333333"/>
-          <w:u w:val="single" w:color="5D5D5D"/>
-        </w:rPr>
-        <w:tab/>
-      </w:r>
-      <w:r>
-        <w:rPr>
-          <w:rFonts w:ascii="Times New Roman"/>
-          <w:color w:val="333333"/>
-          <w:u w:val="single" w:color="5D5D5D"/>
-        </w:rPr>
-        <w:tab/>
-      </w:r>
-      <w:r>
-        <w:rPr>
-          <w:rFonts w:ascii="Times New Roman"/>
-          <w:color w:val="333333"/>
-          <w:u w:val="single" w:color="5D5D5D"/>
-        </w:rPr>
-        <w:tab/>
-      </w:r>
-      <w:r>
-        <w:rPr>
-          <w:rFonts w:ascii="Times New Roman"/>
-          <w:color w:val="333333"/>
-          <w:u w:val="single" w:color="5D5D5D"/>
-        </w:rPr>
-        <w:tab/>
-      </w:r>
-    </w:p>
-    <w:p>
-      <w:pPr>
-        <w:tabs>
-          <w:tab w:val="left" w:pos="964"/>
-          <w:tab w:val="left" w:pos="10072"/>
-        </w:tabs>
-        <w:spacing w:before="18"/>
-        <w:rPr>
-          <w:i/>
-          <w:spacing w:val="-2"/>
-          <w:w w:val="115"/>
-          <w:szCs w:val="26"/>
-        </w:rPr>
-      </w:pPr>
-      <w:r>
-        <w:rPr>
-          <w:color w:val="5D5D5D"/>
-          <w:spacing w:val="-4"/>
-          <w:w w:val="115"/>
-          <w:sz w:val="20"/>
-          <w:szCs w:val="24"/>
-        </w:rPr>
-        <w:t xml:space="preserve">   </w:t>
-      </w:r>
-      <w:r>
-        <w:rPr>
-          <w:color w:val="5D5D5D"/>
-          <w:spacing w:val="-4"/>
-          <w:w w:val="115"/>
-          <w:szCs w:val="26"/>
-        </w:rPr>
-        <w:t>2022</w:t>
-      </w:r>
-      <w:r>
-        <w:rPr>
-          <w:color w:val="5D5D5D"/>
-          <w:szCs w:val="26"/>
-        </w:rPr>
-        <w:tab/>
-      </w:r>
-      <w:r>
-        <w:rPr>
-          <w:bCs/>
-          <w:color w:val="414141"/>
-          <w:w w:val="110"/>
-          <w:szCs w:val="26"/>
-        </w:rPr>
-        <w:t>Cleared</w:t>
-      </w:r>
-      <w:r>
-        <w:rPr>
-          <w:b/>
-          <w:color w:val="414141"/>
-          <w:spacing w:val="-1"/>
-          <w:w w:val="110"/>
-          <w:szCs w:val="26"/>
-        </w:rPr>
-        <w:t xml:space="preserve"> </w:t>
-      </w:r>
-      <w:r>
-        <w:rPr>
-          <w:b/>
-          <w:color w:val="414141"/>
-          <w:w w:val="110"/>
-          <w:szCs w:val="26"/>
-        </w:rPr>
-        <w:t>Bosch</w:t>
-      </w:r>
-      <w:r>
-        <w:rPr>
-          <w:b/>
-          <w:color w:val="414141"/>
-          <w:spacing w:val="-1"/>
-          <w:w w:val="110"/>
-          <w:szCs w:val="26"/>
-        </w:rPr>
-        <w:t xml:space="preserve"> </w:t>
-      </w:r>
-      <w:r>
-        <w:rPr>
-          <w:b/>
-          <w:color w:val="414141"/>
-          <w:w w:val="110"/>
-          <w:szCs w:val="26"/>
-        </w:rPr>
-        <w:t>Hackathon</w:t>
-      </w:r>
-      <w:r>
-        <w:rPr>
-          <w:b/>
-          <w:color w:val="414141"/>
-          <w:spacing w:val="-1"/>
-          <w:w w:val="110"/>
-          <w:szCs w:val="26"/>
-        </w:rPr>
-        <w:t xml:space="preserve"> </w:t>
-      </w:r>
-      <w:r>
-        <w:rPr>
-          <w:b/>
-          <w:color w:val="414141"/>
-          <w:w w:val="110"/>
-          <w:szCs w:val="26"/>
-        </w:rPr>
-        <w:t>Prelims</w:t>
-      </w:r>
-      <w:r>
-        <w:rPr>
-          <w:color w:val="5D5D5D"/>
-          <w:w w:val="110"/>
-          <w:sz w:val="26"/>
-          <w:szCs w:val="26"/>
-        </w:rPr>
-        <w:t xml:space="preserve">, </w:t>
-      </w:r>
-      <w:r>
-        <w:rPr>
-          <w:color w:val="5D5D5D"/>
-          <w:w w:val="110"/>
-          <w:szCs w:val="26"/>
-        </w:rPr>
-        <w:t>Fit.Fest</w:t>
-      </w:r>
-      <w:r>
-        <w:rPr>
-          <w:color w:val="5D5D5D"/>
-          <w:spacing w:val="-1"/>
-          <w:w w:val="110"/>
-          <w:szCs w:val="26"/>
-        </w:rPr>
-        <w:t xml:space="preserve"> </w:t>
-      </w:r>
-      <w:r>
-        <w:rPr>
-          <w:color w:val="5D5D5D"/>
-          <w:w w:val="110"/>
-          <w:szCs w:val="26"/>
-        </w:rPr>
-        <w:t>Conducted</w:t>
-      </w:r>
-      <w:r>
-        <w:rPr>
-          <w:color w:val="5D5D5D"/>
-          <w:spacing w:val="-1"/>
-          <w:w w:val="110"/>
-          <w:szCs w:val="26"/>
-        </w:rPr>
-        <w:t xml:space="preserve"> </w:t>
-      </w:r>
-      <w:r>
-        <w:rPr>
-          <w:color w:val="5D5D5D"/>
-          <w:w w:val="110"/>
-          <w:szCs w:val="26"/>
-        </w:rPr>
-        <w:t>by</w:t>
-      </w:r>
-      <w:r>
-        <w:rPr>
-          <w:color w:val="5D5D5D"/>
-          <w:spacing w:val="-1"/>
-          <w:w w:val="110"/>
-          <w:szCs w:val="26"/>
-        </w:rPr>
-        <w:t xml:space="preserve"> </w:t>
-      </w:r>
-      <w:r>
-        <w:rPr>
-          <w:color w:val="5D5D5D"/>
-          <w:spacing w:val="-2"/>
-          <w:w w:val="110"/>
-          <w:szCs w:val="26"/>
-        </w:rPr>
-        <w:t>Bosch</w:t>
-      </w:r>
-      <w:r>
-        <w:rPr>
-          <w:color w:val="5D5D5D"/>
-          <w:szCs w:val="26"/>
-        </w:rPr>
-        <w:tab/>
-      </w:r>
-      <w:r>
-        <w:rPr>
-          <w:i/>
-          <w:spacing w:val="-2"/>
-          <w:w w:val="115"/>
-          <w:szCs w:val="26"/>
-        </w:rPr>
-        <w:t>India</w:t>
-      </w:r>
-    </w:p>
-    <w:p>
-      <w:pPr>
-        <w:tabs>
-          <w:tab w:val="left" w:pos="964"/>
-          <w:tab w:val="left" w:pos="10072"/>
-        </w:tabs>
-        <w:spacing w:before="18"/>
-        <w:rPr>
-          <w:i/>
-          <w:szCs w:val="26"/>
-        </w:rPr>
-      </w:pPr>
-      <w:r>
-        <w:rPr>
-          <w:color w:val="5D5D5D"/>
-          <w:spacing w:val="-4"/>
-          <w:w w:val="115"/>
-          <w:szCs w:val="26"/>
-        </w:rPr>
-        <w:t xml:space="preserve">  </w:t>
-      </w:r>
-      <w:r>
-        <w:rPr>
-          <w:color w:val="5D5D5D"/>
-          <w:spacing w:val="-4"/>
-          <w:w w:val="115"/>
-          <w:szCs w:val="26"/>
-        </w:rPr>
-        <w:t xml:space="preserve"> </w:t>
-      </w:r>
-      <w:r>
-        <w:rPr>
-          <w:color w:val="5D5D5D"/>
-          <w:spacing w:val="-4"/>
-          <w:w w:val="115"/>
-          <w:szCs w:val="26"/>
-        </w:rPr>
-        <w:t>2019</w:t>
-      </w:r>
-      <w:r>
-        <w:rPr>
-          <w:color w:val="5D5D5D"/>
-          <w:szCs w:val="26"/>
-        </w:rPr>
-        <w:tab/>
-        <w:t xml:space="preserve">Finalist of </w:t>
-      </w:r>
-      <w:r>
-        <w:rPr>
-          <w:b/>
-          <w:color w:val="414141"/>
-          <w:w w:val="110"/>
-          <w:szCs w:val="26"/>
-        </w:rPr>
-        <w:t>AngelHack</w:t>
-      </w:r>
-      <w:r>
-        <w:rPr>
-          <w:color w:val="5D5D5D"/>
-          <w:w w:val="110"/>
-          <w:sz w:val="26"/>
-          <w:szCs w:val="26"/>
-        </w:rPr>
-        <w:t xml:space="preserve">, </w:t>
-      </w:r>
-      <w:r>
-        <w:rPr>
-          <w:color w:val="5D5D5D"/>
-          <w:w w:val="110"/>
-          <w:szCs w:val="26"/>
-        </w:rPr>
-        <w:t>Conducted</w:t>
-      </w:r>
-      <w:r>
-        <w:rPr>
-          <w:color w:val="5D5D5D"/>
-          <w:spacing w:val="-1"/>
-          <w:w w:val="110"/>
-          <w:szCs w:val="26"/>
-        </w:rPr>
-        <w:t xml:space="preserve"> </w:t>
-      </w:r>
-      <w:r>
-        <w:rPr>
-          <w:color w:val="5D5D5D"/>
-          <w:w w:val="110"/>
-          <w:szCs w:val="26"/>
-        </w:rPr>
-        <w:t>by</w:t>
-      </w:r>
-      <w:r>
-        <w:rPr>
-          <w:color w:val="5D5D5D"/>
-          <w:spacing w:val="-1"/>
-          <w:w w:val="110"/>
-          <w:szCs w:val="26"/>
-        </w:rPr>
-        <w:t xml:space="preserve"> </w:t>
-      </w:r>
-      <w:r>
-        <w:rPr>
-          <w:color w:val="5D5D5D"/>
-          <w:spacing w:val="-2"/>
-          <w:w w:val="110"/>
-          <w:szCs w:val="26"/>
-        </w:rPr>
-        <w:t>Kerala Startup Mission</w:t>
-      </w:r>
-      <w:r>
-        <w:rPr>
-          <w:color w:val="5D5D5D"/>
-          <w:szCs w:val="26"/>
-        </w:rPr>
-        <w:tab/>
-      </w:r>
-      <w:r>
-        <w:rPr>
-          <w:i/>
-          <w:spacing w:val="-2"/>
-          <w:w w:val="115"/>
-          <w:szCs w:val="26"/>
-        </w:rPr>
-        <w:t>India</w:t>
-      </w:r>
-    </w:p>
-    <w:p>
-      <w:pPr>
-        <w:pStyle w:val="BodyText"/>
-        <w:spacing w:before="86"/>
-        <w:rPr>
-          <w:i/>
-          <w:sz w:val="20"/>
-          <w:szCs w:val="20"/>
-        </w:rPr>
-      </w:pPr>
-      <w:r>
-        <w:rPr>
-          <w:i/>
-          <w:sz w:val="20"/>
-          <w:szCs w:val="20"/>
-        </w:rPr>
-        <w:t xml:space="preserve"> </w:t>
       </w:r>
     </w:p>
     <w:p>
@@ -3527,6 +3438,7 @@
           <w:szCs w:val="24"/>
         </w:rPr>
       </w:pPr>
+      <w:proofErr w:type="spellStart"/>
       <w:r>
         <w:rPr>
           <w:bCs/>
@@ -3535,7 +3447,18 @@
           <w:w w:val="110"/>
           <w:szCs w:val="24"/>
         </w:rPr>
-        <w:t>TransIot, Kochi</w:t>
+        <w:t>TransIot</w:t>
+      </w:r>
+      <w:proofErr w:type="spellEnd"/>
+      <w:r>
+        <w:rPr>
+          <w:bCs/>
+          <w:color w:val="414141"/>
+          <w:spacing w:val="-2"/>
+          <w:w w:val="110"/>
+          <w:szCs w:val="24"/>
+        </w:rPr>
+        <w:t>, Kochi</w:t>
       </w:r>
     </w:p>
     <w:p>
@@ -3592,6 +3515,123 @@
     </w:p>
     <w:p>
       <w:pPr>
+        <w:tabs>
+          <w:tab w:val="left" w:pos="1005"/>
+        </w:tabs>
+        <w:spacing w:before="41"/>
+        <w:ind w:right="7437"/>
+        <w:jc w:val="both"/>
+        <w:rPr>
+          <w:bCs/>
+          <w:color w:val="414141"/>
+          <w:spacing w:val="-2"/>
+          <w:w w:val="110"/>
+          <w:szCs w:val="24"/>
+        </w:rPr>
+      </w:pPr>
+      <w:r>
+        <w:rPr>
+          <w:b/>
+          <w:color w:val="414141"/>
+          <w:spacing w:val="-2"/>
+          <w:w w:val="110"/>
+          <w:szCs w:val="24"/>
+        </w:rPr>
+        <w:t>Professional</w:t>
+      </w:r>
+      <w:r>
+        <w:rPr>
+          <w:b/>
+          <w:color w:val="414141"/>
+          <w:spacing w:val="-2"/>
+          <w:w w:val="110"/>
+          <w:szCs w:val="24"/>
+        </w:rPr>
+        <w:t xml:space="preserve"> C++ and</w:t>
+      </w:r>
+      <w:r>
+        <w:rPr>
+          <w:b/>
+          <w:color w:val="414141"/>
+          <w:spacing w:val="-2"/>
+          <w:w w:val="110"/>
+          <w:szCs w:val="24"/>
+        </w:rPr>
+        <w:t xml:space="preserve"> </w:t>
+      </w:r>
+      <w:r>
+        <w:rPr>
+          <w:b/>
+          <w:color w:val="414141"/>
+          <w:spacing w:val="-2"/>
+          <w:w w:val="110"/>
+          <w:szCs w:val="24"/>
+        </w:rPr>
+        <w:t>Clean</w:t>
+      </w:r>
+      <w:r>
+        <w:rPr>
+          <w:b/>
+          <w:color w:val="414141"/>
+          <w:spacing w:val="-2"/>
+          <w:w w:val="110"/>
+          <w:szCs w:val="24"/>
+        </w:rPr>
+        <w:t xml:space="preserve"> </w:t>
+      </w:r>
+      <w:r>
+        <w:rPr>
+          <w:b/>
+          <w:color w:val="414141"/>
+          <w:spacing w:val="-2"/>
+          <w:w w:val="110"/>
+          <w:szCs w:val="24"/>
+        </w:rPr>
+        <w:t>code</w:t>
+      </w:r>
+      <w:r>
+        <w:rPr>
+          <w:b/>
+          <w:color w:val="414141"/>
+          <w:spacing w:val="-2"/>
+          <w:w w:val="110"/>
+          <w:szCs w:val="24"/>
+        </w:rPr>
+        <w:t xml:space="preserve"> </w:t>
+      </w:r>
+      <w:r>
+        <w:rPr>
+          <w:b/>
+          <w:color w:val="414141"/>
+          <w:spacing w:val="-2"/>
+          <w:w w:val="110"/>
+          <w:szCs w:val="24"/>
+        </w:rPr>
+        <w:t xml:space="preserve"> </w:t>
+      </w:r>
+      <w:r>
+        <w:rPr>
+          <w:bCs/>
+          <w:color w:val="414141"/>
+          <w:spacing w:val="-2"/>
+          <w:w w:val="110"/>
+          <w:szCs w:val="24"/>
+        </w:rPr>
+        <w:t xml:space="preserve"> </w:t>
+      </w:r>
+      <w:r>
+        <w:rPr>
+          <w:bCs/>
+          <w:color w:val="414141"/>
+          <w:spacing w:val="-2"/>
+          <w:w w:val="110"/>
+          <w:szCs w:val="24"/>
+        </w:rPr>
+        <w:t>Bosch, Coimbatore</w:t>
+      </w:r>
+    </w:p>
+    <w:p>
+      <w:pPr>
         <w:pStyle w:val="ListParagraph"/>
         <w:numPr>
           <w:ilvl w:val="0"/>
@@ -3600,91 +3640,7 @@
         <w:jc w:val="both"/>
       </w:pPr>
       <w:r>
-        <w:t xml:space="preserve">Developed a character device driver (Hypervisor Virtual Console) for communication </w:t>
-      </w:r>
-    </w:p>
-    <w:p>
-      <w:pPr>
-        <w:pStyle w:val="ListParagraph"/>
-        <w:ind w:left="720" w:firstLine="0"/>
-        <w:jc w:val="both"/>
-      </w:pPr>
-      <w:r>
-        <w:t>between virtual machine and guest OS.</w:t>
-      </w:r>
-    </w:p>
-    <w:p>
-      <w:pPr>
-        <w:tabs>
-          <w:tab w:val="left" w:pos="1005"/>
-        </w:tabs>
-        <w:spacing w:before="41"/>
-        <w:ind w:right="7437"/>
-        <w:jc w:val="both"/>
-        <w:rPr>
-          <w:b/>
-          <w:color w:val="414141"/>
-          <w:spacing w:val="-2"/>
-          <w:w w:val="110"/>
-          <w:szCs w:val="24"/>
-        </w:rPr>
-      </w:pPr>
-      <w:r>
-        <w:rPr>
-          <w:b/>
-          <w:color w:val="414141"/>
-          <w:spacing w:val="-2"/>
-          <w:w w:val="110"/>
-          <w:szCs w:val="24"/>
-        </w:rPr>
-        <w:t>Professional</w:t>
-      </w:r>
-      <w:r>
-        <w:rPr>
-          <w:b/>
-          <w:color w:val="414141"/>
-          <w:spacing w:val="-2"/>
-          <w:w w:val="110"/>
-          <w:szCs w:val="24"/>
-        </w:rPr>
-        <w:t xml:space="preserve"> C++ and Clean code</w:t>
-      </w:r>
-      <w:r>
-        <w:rPr>
-          <w:b/>
-          <w:color w:val="414141"/>
-          <w:spacing w:val="-2"/>
-          <w:w w:val="110"/>
-          <w:szCs w:val="24"/>
-        </w:rPr>
-        <w:t xml:space="preserve"> </w:t>
-      </w:r>
-    </w:p>
-    <w:p>
-      <w:pPr>
-        <w:tabs>
-          <w:tab w:val="left" w:pos="1005"/>
-        </w:tabs>
-        <w:spacing w:before="41"/>
-        <w:ind w:right="7437"/>
-        <w:jc w:val="both"/>
-        <w:rPr>
-          <w:bCs/>
-          <w:color w:val="414141"/>
-          <w:spacing w:val="-2"/>
-          <w:w w:val="110"/>
-          <w:szCs w:val="24"/>
-        </w:rPr>
-      </w:pPr>
-      <w:r>
-        <w:rPr>
-          <w:bCs/>
-          <w:color w:val="414141"/>
-          <w:spacing w:val="-2"/>
-          <w:w w:val="110"/>
-          <w:szCs w:val="24"/>
-        </w:rPr>
-        <w:t>Bosch, Coimbatore</w:t>
+        <w:t>Leveraged the OOPs and SOLID principles with examples.</w:t>
       </w:r>
     </w:p>
     <w:p>
@@ -3697,7 +3653,16 @@
         <w:jc w:val="both"/>
       </w:pPr>
       <w:r>
-        <w:t>Leveraged the OOPs and SOLID principles with examples.</w:t>
+        <w:t>Discussed c</w:t>
+      </w:r>
+      <w:r>
+        <w:t>ommon pitfalls in C++</w:t>
+      </w:r>
+      <w:r>
+        <w:t xml:space="preserve"> for embedded software development.</w:t>
+      </w:r>
+      <w:r>
+        <w:t xml:space="preserve"> </w:t>
       </w:r>
     </w:p>
     <w:p>
@@ -3710,16 +3675,13 @@
         <w:jc w:val="both"/>
       </w:pPr>
       <w:r>
-        <w:t>Discussed c</w:t>
-      </w:r>
-      <w:r>
-        <w:t>ommon pitfalls in C++</w:t>
-      </w:r>
-      <w:r>
-        <w:t xml:space="preserve"> for embedded software development.</w:t>
-      </w:r>
-      <w:r>
-        <w:t xml:space="preserve"> </w:t>
+        <w:t xml:space="preserve">Covered </w:t>
+      </w:r>
+      <w:r>
+        <w:t xml:space="preserve">Design Patterns </w:t>
+      </w:r>
+      <w:r>
+        <w:t>explaining their roles in code reusability and scalability.</w:t>
       </w:r>
     </w:p>
     <w:p>
@@ -3732,25 +3694,6 @@
         <w:jc w:val="both"/>
       </w:pPr>
       <w:r>
-        <w:t xml:space="preserve">Covered </w:t>
-      </w:r>
-      <w:r>
-        <w:t xml:space="preserve">Design Patterns </w:t>
-      </w:r>
-      <w:r>
-        <w:t>explaining their roles in code reusability and scalability.</w:t>
-      </w:r>
-    </w:p>
-    <w:p>
-      <w:pPr>
-        <w:pStyle w:val="ListParagraph"/>
-        <w:numPr>
-          <w:ilvl w:val="0"/>
-          <w:numId w:val="7"/>
-        </w:numPr>
-        <w:jc w:val="both"/>
-      </w:pPr>
-      <w:r>
         <w:t xml:space="preserve">Clean coding guidelines </w:t>
       </w:r>
       <w:r>
@@ -3812,6 +3755,7 @@
           <w:sz w:val="18"/>
         </w:rPr>
       </w:pPr>
+      <w:proofErr w:type="spellStart"/>
       <w:r>
         <w:rPr>
           <w:rFonts w:ascii="Bahnschrift SemiBold" w:hAnsi="Bahnschrift SemiBold" w:cs="Bahnschrift SemiBold"/>
@@ -3820,7 +3764,18 @@
           <w:sz w:val="26"/>
           <w:szCs w:val="26"/>
         </w:rPr>
-        <w:t>Rajagiri School of Engineering and Technology</w:t>
+        <w:t>Rajagiri</w:t>
+      </w:r>
+      <w:proofErr w:type="spellEnd"/>
+      <w:r>
+        <w:rPr>
+          <w:rFonts w:ascii="Bahnschrift SemiBold" w:hAnsi="Bahnschrift SemiBold" w:cs="Bahnschrift SemiBold"/>
+          <w:b w:val="0"/>
+          <w:w w:val="105"/>
+          <w:sz w:val="26"/>
+          <w:szCs w:val="26"/>
+        </w:rPr>
+        <w:t xml:space="preserve"> School of Engineering and Technology</w:t>
       </w:r>
       <w:r>
         <w:rPr>
@@ -4001,7 +3956,7 @@
 </file>
 
 <file path=word/numbering.xml><?xml version="1.0" encoding="utf-8"?>
-<w:numbering xmlns:wpc="http://schemas.microsoft.com/office/word/2010/wordprocessingCanvas" xmlns:cx="http://schemas.microsoft.com/office/drawing/2014/chartex" xmlns:cx1="http://schemas.microsoft.com/office/drawing/2015/9/8/chartex" xmlns:cx2="http://schemas.microsoft.com/office/drawing/2015/10/21/chartex" xmlns:cx3="http://schemas.microsoft.com/office/drawing/2016/5/9/chartex" xmlns:cx4="http://schemas.microsoft.com/office/drawing/2016/5/10/chartex" xmlns:cx5="http://schemas.microsoft.com/office/drawing/2016/5/11/chartex" xmlns:cx6="http://schemas.microsoft.com/office/drawing/2016/5/12/chartex" xmlns:cx7="http://schemas.microsoft.com/office/drawing/2016/5/13/chartex" xmlns:cx8="http://schemas.microsoft.com/office/drawing/2016/5/14/chartex" xmlns:mc="http://schemas.openxmlformats.org/markup-compatibility/2006" xmlns:aink="http://schemas.microsoft.com/office/drawing/2016/ink" xmlns:am3d="http://schemas.microsoft.com/office/drawing/2017/model3d" xmlns:o="urn:schemas-microsoft-com:office:office" xmlns:oel="http://schemas.microsoft.com/office/2019/extlst" xmlns:r="http://schemas.openxmlformats.org/officeDocument/2006/relationships" xmlns:m="http://schemas.openxmlformats.org/officeDocument/2006/math" xmlns:v="urn:schemas-microsoft-com:vml" xmlns:wp14="http://schemas.microsoft.com/office/word/2010/wordprocessingDrawing" xmlns:wp="http://schemas.openxmlformats.org/drawingml/2006/wordprocessingDrawing" xmlns:w10="urn:schemas-microsoft-com:office:word" xmlns:w="http://schemas.openxmlformats.org/wordprocessingml/2006/main" xmlns:w14="http://schemas.microsoft.com/office/word/2010/wordml" xmlns:w15="http://schemas.microsoft.com/office/word/2012/wordml" xmlns:w16cex="http://schemas.microsoft.com/office/word/2018/wordml/cex" xmlns:w16cid="http://schemas.microsoft.com/office/word/2016/wordml/cid" xmlns:w16="http://schemas.microsoft.com/office/word/2018/wordml" xmlns:w16du="http://schemas.microsoft.com/office/word/2023/wordml/word16du" xmlns:w16sdtdh="http://schemas.microsoft.com/office/word/2020/wordml/sdtdatahash" xmlns:w16se="http://schemas.microsoft.com/office/word/2015/wordml/symex" xmlns:wpg="http://schemas.microsoft.com/office/word/2010/wordprocessingGroup" xmlns:wpi="http://schemas.microsoft.com/office/word/2010/wordprocessingInk" xmlns:wne="http://schemas.microsoft.com/office/word/2006/wordml" xmlns:wps="http://schemas.microsoft.com/office/word/2010/wordprocessingShape" mc:Ignorable="w14 w15 w16se w16cid w16 w16cex w16sdtdh w16du wp14">
+<w:numbering xmlns:wpc="http://schemas.microsoft.com/office/word/2010/wordprocessingCanvas" xmlns:cx="http://schemas.microsoft.com/office/drawing/2014/chartex" xmlns:cx1="http://schemas.microsoft.com/office/drawing/2015/9/8/chartex" xmlns:cx2="http://schemas.microsoft.com/office/drawing/2015/10/21/chartex" xmlns:cx3="http://schemas.microsoft.com/office/drawing/2016/5/9/chartex" xmlns:cx4="http://schemas.microsoft.com/office/drawing/2016/5/10/chartex" xmlns:cx5="http://schemas.microsoft.com/office/drawing/2016/5/11/chartex" xmlns:cx6="http://schemas.microsoft.com/office/drawing/2016/5/12/chartex" xmlns:cx7="http://schemas.microsoft.com/office/drawing/2016/5/13/chartex" xmlns:cx8="http://schemas.microsoft.com/office/drawing/2016/5/14/chartex" xmlns:mc="http://schemas.openxmlformats.org/markup-compatibility/2006" xmlns:aink="http://schemas.microsoft.com/office/drawing/2016/ink" xmlns:am3d="http://schemas.microsoft.com/office/drawing/2017/model3d" xmlns:o="urn:schemas-microsoft-com:office:office" xmlns:oel="http://schemas.microsoft.com/office/2019/extlst" xmlns:r="http://schemas.openxmlformats.org/officeDocument/2006/relationships" xmlns:m="http://schemas.openxmlformats.org/officeDocument/2006/math" xmlns:v="urn:schemas-microsoft-com:vml" xmlns:wp14="http://schemas.microsoft.com/office/word/2010/wordprocessingDrawing" xmlns:wp="http://schemas.openxmlformats.org/drawingml/2006/wordprocessingDrawing" xmlns:w10="urn:schemas-microsoft-com:office:word" xmlns:w="http://schemas.openxmlformats.org/wordprocessingml/2006/main" xmlns:w14="http://schemas.microsoft.com/office/word/2010/wordml" xmlns:w15="http://schemas.microsoft.com/office/word/2012/wordml" xmlns:w16cex="http://schemas.microsoft.com/office/word/2018/wordml/cex" xmlns:w16cid="http://schemas.microsoft.com/office/word/2016/wordml/cid" xmlns:w16="http://schemas.microsoft.com/office/word/2018/wordml" xmlns:w16du="http://schemas.microsoft.com/office/word/2023/wordml/word16du" xmlns:w16sdtdh="http://schemas.microsoft.com/office/word/2020/wordml/sdtdatahash" xmlns:w16sdtfl="http://schemas.microsoft.com/office/word/2024/wordml/sdtformatlock" xmlns:w16se="http://schemas.microsoft.com/office/word/2015/wordml/symex" xmlns:wpg="http://schemas.microsoft.com/office/word/2010/wordprocessingGroup" xmlns:wpi="http://schemas.microsoft.com/office/word/2010/wordprocessingInk" xmlns:wne="http://schemas.microsoft.com/office/word/2006/wordml" xmlns:wps="http://schemas.microsoft.com/office/word/2010/wordprocessingShape" mc:Ignorable="w14 w15 w16se w16cid w16 w16cex w16sdtdh w16sdtfl w16du wp14">
   <w:abstractNum w:abstractNumId="0" w15:restartNumberingAfterBreak="0">
     <w:nsid w:val="08305650"/>
     <w:multiLevelType w:val="hybridMultilevel"/>
@@ -5471,7 +5426,7 @@
 </file>
 
 <file path=word/styles.xml><?xml version="1.0" encoding="utf-8"?>
-<w:styles xmlns:mc="http://schemas.openxmlformats.org/markup-compatibility/2006" xmlns:r="http://schemas.openxmlformats.org/officeDocument/2006/relationships" xmlns:w="http://schemas.openxmlformats.org/wordprocessingml/2006/main" xmlns:w14="http://schemas.microsoft.com/office/word/2010/wordml" xmlns:w15="http://schemas.microsoft.com/office/word/2012/wordml" xmlns:w16cex="http://schemas.microsoft.com/office/word/2018/wordml/cex" xmlns:w16cid="http://schemas.microsoft.com/office/word/2016/wordml/cid" xmlns:w16="http://schemas.microsoft.com/office/word/2018/wordml" xmlns:w16du="http://schemas.microsoft.com/office/word/2023/wordml/word16du" xmlns:w16sdtdh="http://schemas.microsoft.com/office/word/2020/wordml/sdtdatahash" xmlns:w16se="http://schemas.microsoft.com/office/word/2015/wordml/symex" mc:Ignorable="w14 w15 w16se w16cid w16 w16cex w16sdtdh w16du">
+<w:styles xmlns:mc="http://schemas.openxmlformats.org/markup-compatibility/2006" xmlns:r="http://schemas.openxmlformats.org/officeDocument/2006/relationships" xmlns:w="http://schemas.openxmlformats.org/wordprocessingml/2006/main" xmlns:w14="http://schemas.microsoft.com/office/word/2010/wordml" xmlns:w15="http://schemas.microsoft.com/office/word/2012/wordml" xmlns:w16cex="http://schemas.microsoft.com/office/word/2018/wordml/cex" xmlns:w16cid="http://schemas.microsoft.com/office/word/2016/wordml/cid" xmlns:w16="http://schemas.microsoft.com/office/word/2018/wordml" xmlns:w16du="http://schemas.microsoft.com/office/word/2023/wordml/word16du" xmlns:w16sdtdh="http://schemas.microsoft.com/office/word/2020/wordml/sdtdatahash" xmlns:w16sdtfl="http://schemas.microsoft.com/office/word/2024/wordml/sdtformatlock" xmlns:w16se="http://schemas.microsoft.com/office/word/2015/wordml/symex" mc:Ignorable="w14 w15 w16se w16cid w16 w16cex w16sdtdh w16sdtfl w16du">
   <w:docDefaults>
     <w:rPrDefault>
       <w:rPr>

</xml_diff>

<commit_message>
Added the Professional experience details and resume updation
</commit_message>
<xml_diff>
--- a/assets/CV/RobinCR_Software_Developer.docx
+++ b/assets/CV/RobinCR_Software_Developer.docx
@@ -1283,130 +1283,317 @@
     </w:p>
     <w:p>
       <w:pPr>
-        <w:pStyle w:val="ListParagraph"/>
+        <w:pStyle w:val="my-0"/>
         <w:numPr>
           <w:ilvl w:val="0"/>
-          <w:numId w:val="9"/>
+          <w:numId w:val="13"/>
         </w:numPr>
-      </w:pPr>
-      <w:r>
-        <w:t>Playback tool developer</w:t>
-      </w:r>
-      <w:r>
-        <w:t>.</w:t>
-      </w:r>
-    </w:p>
-    <w:p>
-      <w:pPr>
-        <w:pStyle w:val="ListParagraph"/>
+        <w:pBdr>
+          <w:top w:val="single" w:sz="2" w:space="0" w:color="E5E7EB"/>
+          <w:left w:val="single" w:sz="2" w:space="0" w:color="E5E7EB"/>
+          <w:bottom w:val="single" w:sz="2" w:space="0" w:color="E5E7EB"/>
+          <w:right w:val="single" w:sz="2" w:space="0" w:color="E5E7EB"/>
+        </w:pBdr>
+        <w:spacing w:before="0" w:beforeAutospacing="0" w:after="0" w:afterAutospacing="0"/>
+        <w:rPr>
+          <w:rFonts w:ascii="Liberation Sans Narrow" w:hAnsi="Liberation Sans Narrow" w:cs="Segoe UI"/>
+          <w:sz w:val="22"/>
+          <w:szCs w:val="22"/>
+        </w:rPr>
+      </w:pPr>
+      <w:r>
+        <w:rPr>
+          <w:rFonts w:ascii="Liberation Sans Narrow" w:hAnsi="Liberation Sans Narrow" w:cs="Segoe UI"/>
+          <w:sz w:val="22"/>
+          <w:szCs w:val="22"/>
+        </w:rPr>
+        <w:t xml:space="preserve">Engineered </w:t>
+      </w:r>
+      <w:r>
+        <w:rPr>
+          <w:rFonts w:ascii="Liberation Sans Narrow" w:hAnsi="Liberation Sans Narrow" w:cs="Segoe UI"/>
+          <w:sz w:val="22"/>
+          <w:szCs w:val="22"/>
+        </w:rPr>
+        <w:t>M</w:t>
+      </w:r>
+      <w:r>
+        <w:rPr>
+          <w:rFonts w:ascii="Liberation Sans Narrow" w:hAnsi="Liberation Sans Narrow" w:cs="Segoe UI"/>
+          <w:sz w:val="22"/>
+          <w:szCs w:val="22"/>
+        </w:rPr>
+        <w:t xml:space="preserve">oving </w:t>
+      </w:r>
+      <w:r>
+        <w:rPr>
+          <w:rFonts w:ascii="Liberation Sans Narrow" w:hAnsi="Liberation Sans Narrow" w:cs="Segoe UI"/>
+          <w:sz w:val="22"/>
+          <w:szCs w:val="22"/>
+        </w:rPr>
+        <w:t>O</w:t>
+      </w:r>
+      <w:r>
+        <w:rPr>
+          <w:rFonts w:ascii="Liberation Sans Narrow" w:hAnsi="Liberation Sans Narrow" w:cs="Segoe UI"/>
+          <w:sz w:val="22"/>
+          <w:szCs w:val="22"/>
+        </w:rPr>
+        <w:t xml:space="preserve">bstacle </w:t>
+      </w:r>
+      <w:r>
+        <w:rPr>
+          <w:rFonts w:ascii="Liberation Sans Narrow" w:hAnsi="Liberation Sans Narrow" w:cs="Segoe UI"/>
+          <w:sz w:val="22"/>
+          <w:szCs w:val="22"/>
+        </w:rPr>
+        <w:t>D</w:t>
+      </w:r>
+      <w:r>
+        <w:rPr>
+          <w:rFonts w:ascii="Liberation Sans Narrow" w:hAnsi="Liberation Sans Narrow" w:cs="Segoe UI"/>
+          <w:sz w:val="22"/>
+          <w:szCs w:val="22"/>
+        </w:rPr>
+        <w:t>etection solutions leveraging lidar sensor.</w:t>
+      </w:r>
+    </w:p>
+    <w:p>
+      <w:pPr>
+        <w:pStyle w:val="my-0"/>
         <w:numPr>
           <w:ilvl w:val="0"/>
-          <w:numId w:val="9"/>
+          <w:numId w:val="13"/>
         </w:numPr>
-      </w:pPr>
-      <w:proofErr w:type="spellStart"/>
-      <w:r>
-        <w:t>Rangeimage</w:t>
-      </w:r>
-      <w:proofErr w:type="spellEnd"/>
-      <w:r>
-        <w:t xml:space="preserve"> to point cloud converter for various lidars</w:t>
-      </w:r>
-      <w:r>
-        <w:t>.</w:t>
-      </w:r>
-    </w:p>
-    <w:p>
-      <w:pPr>
-        <w:pStyle w:val="ListParagraph"/>
+        <w:pBdr>
+          <w:top w:val="single" w:sz="2" w:space="0" w:color="E5E7EB"/>
+          <w:left w:val="single" w:sz="2" w:space="0" w:color="E5E7EB"/>
+          <w:bottom w:val="single" w:sz="2" w:space="0" w:color="E5E7EB"/>
+          <w:right w:val="single" w:sz="2" w:space="0" w:color="E5E7EB"/>
+        </w:pBdr>
+        <w:spacing w:before="0" w:beforeAutospacing="0" w:after="0" w:afterAutospacing="0"/>
+        <w:rPr>
+          <w:rFonts w:ascii="Liberation Sans Narrow" w:hAnsi="Liberation Sans Narrow" w:cs="Segoe UI"/>
+          <w:sz w:val="22"/>
+          <w:szCs w:val="22"/>
+        </w:rPr>
+      </w:pPr>
+      <w:r>
+        <w:rPr>
+          <w:rFonts w:ascii="Liberation Sans Narrow" w:hAnsi="Liberation Sans Narrow" w:cs="Segoe UI"/>
+          <w:sz w:val="22"/>
+          <w:szCs w:val="22"/>
+        </w:rPr>
+        <w:t>Built and optimized Range</w:t>
+      </w:r>
+      <w:r>
+        <w:rPr>
+          <w:rFonts w:ascii="Liberation Sans Narrow" w:hAnsi="Liberation Sans Narrow" w:cs="Segoe UI"/>
+          <w:sz w:val="22"/>
+          <w:szCs w:val="22"/>
+        </w:rPr>
+        <w:t xml:space="preserve"> i</w:t>
+      </w:r>
+      <w:r>
+        <w:rPr>
+          <w:rFonts w:ascii="Liberation Sans Narrow" w:hAnsi="Liberation Sans Narrow" w:cs="Segoe UI"/>
+          <w:sz w:val="22"/>
+          <w:szCs w:val="22"/>
+        </w:rPr>
+        <w:t>mage-to-point cloud converters, enabling support for multiple lidar types.</w:t>
+      </w:r>
+    </w:p>
+    <w:p>
+      <w:pPr>
+        <w:pStyle w:val="my-0"/>
         <w:numPr>
           <w:ilvl w:val="0"/>
-          <w:numId w:val="9"/>
+          <w:numId w:val="13"/>
         </w:numPr>
-      </w:pPr>
-      <w:r>
-        <w:t>Amenders for lidar logs</w:t>
-      </w:r>
-      <w:r>
-        <w:t>.</w:t>
-      </w:r>
-    </w:p>
-    <w:p>
-      <w:pPr>
-        <w:pStyle w:val="ListParagraph"/>
+        <w:pBdr>
+          <w:top w:val="single" w:sz="2" w:space="0" w:color="E5E7EB"/>
+          <w:left w:val="single" w:sz="2" w:space="0" w:color="E5E7EB"/>
+          <w:bottom w:val="single" w:sz="2" w:space="0" w:color="E5E7EB"/>
+          <w:right w:val="single" w:sz="2" w:space="0" w:color="E5E7EB"/>
+        </w:pBdr>
+        <w:spacing w:before="0" w:beforeAutospacing="0" w:after="0" w:afterAutospacing="0"/>
+        <w:rPr>
+          <w:rFonts w:ascii="Liberation Sans Narrow" w:hAnsi="Liberation Sans Narrow" w:cs="Segoe UI"/>
+          <w:sz w:val="22"/>
+          <w:szCs w:val="22"/>
+        </w:rPr>
+      </w:pPr>
+      <w:r>
+        <w:rPr>
+          <w:rFonts w:ascii="Liberation Sans Narrow" w:hAnsi="Liberation Sans Narrow" w:cs="Segoe UI"/>
+          <w:sz w:val="22"/>
+          <w:szCs w:val="22"/>
+        </w:rPr>
+        <w:t>Created and maintained efficient parsers for ROS node communication.</w:t>
+      </w:r>
+    </w:p>
+    <w:p>
+      <w:pPr>
+        <w:pStyle w:val="my-0"/>
         <w:numPr>
           <w:ilvl w:val="0"/>
-          <w:numId w:val="9"/>
+          <w:numId w:val="13"/>
         </w:numPr>
-      </w:pPr>
-      <w:r>
-        <w:t xml:space="preserve">Parsers for </w:t>
-      </w:r>
-      <w:r>
-        <w:t>ROS node communication.</w:t>
-      </w:r>
-    </w:p>
-    <w:p>
-      <w:pPr>
-        <w:pStyle w:val="ListParagraph"/>
+        <w:pBdr>
+          <w:top w:val="single" w:sz="2" w:space="0" w:color="E5E7EB"/>
+          <w:left w:val="single" w:sz="2" w:space="0" w:color="E5E7EB"/>
+          <w:bottom w:val="single" w:sz="2" w:space="0" w:color="E5E7EB"/>
+          <w:right w:val="single" w:sz="2" w:space="0" w:color="E5E7EB"/>
+        </w:pBdr>
+        <w:spacing w:before="0" w:beforeAutospacing="0" w:after="0" w:afterAutospacing="0"/>
+        <w:rPr>
+          <w:rFonts w:ascii="Liberation Sans Narrow" w:hAnsi="Liberation Sans Narrow" w:cs="Segoe UI"/>
+          <w:sz w:val="22"/>
+          <w:szCs w:val="22"/>
+        </w:rPr>
+      </w:pPr>
+      <w:r>
+        <w:rPr>
+          <w:rFonts w:ascii="Liberation Sans Narrow" w:hAnsi="Liberation Sans Narrow" w:cs="Segoe UI"/>
+          <w:sz w:val="22"/>
+          <w:szCs w:val="22"/>
+        </w:rPr>
+        <w:t xml:space="preserve">Integrated open-source </w:t>
+      </w:r>
+      <w:r>
+        <w:rPr>
+          <w:rFonts w:ascii="Liberation Sans Narrow" w:hAnsi="Liberation Sans Narrow" w:cs="Segoe UI"/>
+          <w:sz w:val="22"/>
+          <w:szCs w:val="22"/>
+        </w:rPr>
+        <w:t>P</w:t>
+      </w:r>
+      <w:r>
+        <w:rPr>
+          <w:rFonts w:ascii="Liberation Sans Narrow" w:hAnsi="Liberation Sans Narrow" w:cs="Segoe UI"/>
+          <w:sz w:val="22"/>
+          <w:szCs w:val="22"/>
+        </w:rPr>
+        <w:t xml:space="preserve">oint </w:t>
+      </w:r>
+      <w:r>
+        <w:rPr>
+          <w:rFonts w:ascii="Liberation Sans Narrow" w:hAnsi="Liberation Sans Narrow" w:cs="Segoe UI"/>
+          <w:sz w:val="22"/>
+          <w:szCs w:val="22"/>
+        </w:rPr>
+        <w:t>C</w:t>
+      </w:r>
+      <w:r>
+        <w:rPr>
+          <w:rFonts w:ascii="Liberation Sans Narrow" w:hAnsi="Liberation Sans Narrow" w:cs="Segoe UI"/>
+          <w:sz w:val="22"/>
+          <w:szCs w:val="22"/>
+        </w:rPr>
+        <w:t>loud libraries into C++ projects to accelerate development.</w:t>
+      </w:r>
+    </w:p>
+    <w:p>
+      <w:pPr>
+        <w:pStyle w:val="my-0"/>
         <w:numPr>
           <w:ilvl w:val="0"/>
-          <w:numId w:val="9"/>
+          <w:numId w:val="13"/>
         </w:numPr>
-      </w:pPr>
-      <w:r>
-        <w:rPr>
-          <w:bCs/>
-          <w:szCs w:val="24"/>
-        </w:rPr>
-        <w:t>Developed APIs to work on multi-threaded application using modern C++.</w:t>
-      </w:r>
-    </w:p>
-    <w:p>
-      <w:pPr>
-        <w:pStyle w:val="ListParagraph"/>
+        <w:pBdr>
+          <w:top w:val="single" w:sz="2" w:space="0" w:color="E5E7EB"/>
+          <w:left w:val="single" w:sz="2" w:space="0" w:color="E5E7EB"/>
+          <w:bottom w:val="single" w:sz="2" w:space="0" w:color="E5E7EB"/>
+          <w:right w:val="single" w:sz="2" w:space="0" w:color="E5E7EB"/>
+        </w:pBdr>
+        <w:spacing w:before="0" w:beforeAutospacing="0" w:after="0" w:afterAutospacing="0"/>
+        <w:rPr>
+          <w:rFonts w:ascii="Liberation Sans Narrow" w:hAnsi="Liberation Sans Narrow" w:cs="Segoe UI"/>
+          <w:sz w:val="22"/>
+          <w:szCs w:val="22"/>
+        </w:rPr>
+      </w:pPr>
+      <w:r>
+        <w:rPr>
+          <w:rFonts w:ascii="Liberation Sans Narrow" w:hAnsi="Liberation Sans Narrow" w:cs="Segoe UI"/>
+          <w:sz w:val="22"/>
+          <w:szCs w:val="22"/>
+        </w:rPr>
+        <w:t>Worked in Path planning, Sensor fusion</w:t>
+      </w:r>
+      <w:r>
+        <w:rPr>
+          <w:rFonts w:ascii="Liberation Sans Narrow" w:hAnsi="Liberation Sans Narrow" w:cs="Segoe UI"/>
+          <w:sz w:val="22"/>
+          <w:szCs w:val="22"/>
+        </w:rPr>
+        <w:t xml:space="preserve"> and </w:t>
+      </w:r>
+      <w:r>
+        <w:rPr>
+          <w:rFonts w:ascii="Liberation Sans Narrow" w:hAnsi="Liberation Sans Narrow" w:cs="Segoe UI"/>
+          <w:sz w:val="22"/>
+          <w:szCs w:val="22"/>
+        </w:rPr>
+        <w:t>SLAM algorithms.</w:t>
+      </w:r>
+    </w:p>
+    <w:p>
+      <w:pPr>
+        <w:pStyle w:val="my-0"/>
         <w:numPr>
           <w:ilvl w:val="0"/>
-          <w:numId w:val="9"/>
+          <w:numId w:val="13"/>
         </w:numPr>
-      </w:pPr>
-      <w:r>
-        <w:t xml:space="preserve">Integrated third-party </w:t>
-      </w:r>
-      <w:r>
-        <w:t>libraries</w:t>
-      </w:r>
-      <w:r>
-        <w:t xml:space="preserve"> (</w:t>
-      </w:r>
-      <w:r>
-        <w:t>Point Cloud)</w:t>
-      </w:r>
-      <w:r>
-        <w:t xml:space="preserve"> into C++ project.</w:t>
-      </w:r>
-    </w:p>
-    <w:p>
-      <w:pPr>
-        <w:pStyle w:val="ListParagraph"/>
+        <w:pBdr>
+          <w:top w:val="single" w:sz="2" w:space="0" w:color="E5E7EB"/>
+          <w:left w:val="single" w:sz="2" w:space="0" w:color="E5E7EB"/>
+          <w:bottom w:val="single" w:sz="2" w:space="0" w:color="E5E7EB"/>
+          <w:right w:val="single" w:sz="2" w:space="0" w:color="E5E7EB"/>
+        </w:pBdr>
+        <w:spacing w:before="0" w:beforeAutospacing="0" w:after="0" w:afterAutospacing="0"/>
+        <w:rPr>
+          <w:rFonts w:ascii="Liberation Sans Narrow" w:hAnsi="Liberation Sans Narrow" w:cs="Segoe UI"/>
+          <w:sz w:val="22"/>
+          <w:szCs w:val="22"/>
+        </w:rPr>
+      </w:pPr>
+      <w:r>
+        <w:rPr>
+          <w:rFonts w:ascii="Liberation Sans Narrow" w:hAnsi="Liberation Sans Narrow" w:cs="Segoe UI"/>
+          <w:sz w:val="22"/>
+          <w:szCs w:val="22"/>
+        </w:rPr>
+        <w:t>Drove KPI improvements by investigating and resolving root causes of KPI mismatches.</w:t>
+      </w:r>
+    </w:p>
+    <w:p>
+      <w:pPr>
+        <w:pStyle w:val="my-0"/>
         <w:numPr>
           <w:ilvl w:val="0"/>
-          <w:numId w:val="9"/>
+          <w:numId w:val="13"/>
         </w:numPr>
-      </w:pPr>
-      <w:r>
-        <w:rPr>
-          <w:bCs/>
-          <w:szCs w:val="24"/>
-        </w:rPr>
-        <w:t>Publisher and subscriber channels in ROS2 Noetic modules</w:t>
-      </w:r>
-      <w:r>
-        <w:rPr>
-          <w:bCs/>
-          <w:szCs w:val="24"/>
-        </w:rPr>
-        <w:t>.</w:t>
+        <w:pBdr>
+          <w:top w:val="single" w:sz="2" w:space="0" w:color="E5E7EB"/>
+          <w:left w:val="single" w:sz="2" w:space="0" w:color="E5E7EB"/>
+          <w:bottom w:val="single" w:sz="2" w:space="0" w:color="E5E7EB"/>
+          <w:right w:val="single" w:sz="2" w:space="0" w:color="E5E7EB"/>
+        </w:pBdr>
+        <w:spacing w:before="0" w:beforeAutospacing="0" w:after="0" w:afterAutospacing="0"/>
+        <w:rPr>
+          <w:rFonts w:ascii="Liberation Sans Narrow" w:hAnsi="Liberation Sans Narrow" w:cs="Segoe UI"/>
+          <w:sz w:val="22"/>
+          <w:szCs w:val="22"/>
+        </w:rPr>
+      </w:pPr>
+      <w:r>
+        <w:rPr>
+          <w:rFonts w:ascii="Liberation Sans Narrow" w:hAnsi="Liberation Sans Narrow" w:cs="Segoe UI"/>
+          <w:sz w:val="22"/>
+          <w:szCs w:val="22"/>
+        </w:rPr>
+        <w:t>Developed robust backend systems for a playback tool.</w:t>
       </w:r>
     </w:p>
     <w:p>
@@ -1729,6 +1916,16 @@
         </w:rPr>
         <w:t>Interior Monitoring System (IMS) Project</w:t>
       </w:r>
+      <w:r>
+        <w:rPr>
+          <w:b/>
+          <w:bCs/>
+          <w:color w:val="000000"/>
+          <w:sz w:val="20"/>
+          <w:szCs w:val="24"/>
+        </w:rPr>
+        <w:t xml:space="preserve"> – Camera Perception</w:t>
+      </w:r>
     </w:p>
     <w:p>
       <w:pPr>
@@ -1805,16 +2002,7 @@
         </w:numPr>
       </w:pPr>
       <w:r>
-        <w:t xml:space="preserve">Successfully addressed and resolved Level 8 and 9 QAC++ warnings in the codebase, adhering to </w:t>
-      </w:r>
-    </w:p>
-    <w:p>
-      <w:pPr>
-        <w:pStyle w:val="ListParagraph"/>
-        <w:ind w:left="846" w:firstLine="0"/>
-      </w:pPr>
-      <w:r>
-        <w:t>MISRA coding standards</w:t>
+        <w:t>Successfully addressed and resolved Level 8 and 9 QAC++ warnings in the codebase</w:t>
       </w:r>
       <w:r>
         <w:t>.</w:t>
@@ -1976,23 +2164,6 @@
     </w:p>
     <w:p>
       <w:pPr>
-        <w:pStyle w:val="ListParagraph"/>
-        <w:numPr>
-          <w:ilvl w:val="0"/>
-          <w:numId w:val="10"/>
-        </w:numPr>
-      </w:pPr>
-      <w:proofErr w:type="spellStart"/>
-      <w:r>
-        <w:t>Cmake</w:t>
-      </w:r>
-      <w:proofErr w:type="spellEnd"/>
-      <w:r>
-        <w:t xml:space="preserve"> integration to the modules.</w:t>
-      </w:r>
-    </w:p>
-    <w:p>
-      <w:pPr>
         <w:tabs>
           <w:tab w:val="left" w:pos="9138"/>
         </w:tabs>
@@ -2340,7 +2511,6 @@
         <w:tabs>
           <w:tab w:val="left" w:pos="10462"/>
         </w:tabs>
-        <w:ind w:left="0"/>
         <w:rPr>
           <w:w w:val="115"/>
         </w:rPr>
@@ -2366,6 +2536,18 @@
         </w:tabs>
         <w:ind w:left="0"/>
         <w:rPr>
+          <w:w w:val="115"/>
+        </w:rPr>
+      </w:pPr>
+    </w:p>
+    <w:p>
+      <w:pPr>
+        <w:pStyle w:val="Heading1"/>
+        <w:tabs>
+          <w:tab w:val="left" w:pos="10462"/>
+        </w:tabs>
+        <w:ind w:left="0"/>
+        <w:rPr>
           <w:rFonts w:ascii="Times New Roman"/>
           <w:b w:val="0"/>
         </w:rPr>
@@ -2406,6 +2588,10 @@
     <w:p>
       <w:pPr>
         <w:pStyle w:val="Heading2"/>
+        <w:numPr>
+          <w:ilvl w:val="0"/>
+          <w:numId w:val="14"/>
+        </w:numPr>
         <w:tabs>
           <w:tab w:val="left" w:pos="10004"/>
         </w:tabs>
@@ -2446,20 +2632,36 @@
       </w:r>
       <w:bookmarkEnd w:id="0"/>
       <w:r>
-        <w:rPr>
-          <w:color w:val="414141"/>
-        </w:rPr>
-        <w:tab/>
+        <w:t xml:space="preserve"> :</w:t>
+      </w:r>
+      <w:r>
+        <w:t xml:space="preserve"> </w:t>
       </w:r>
       <w:r>
         <w:rPr>
           <w:b w:val="0"/>
-          <w:i/>
-          <w:spacing w:val="-2"/>
-          <w:w w:val="115"/>
-          <w:sz w:val="18"/>
-        </w:rPr>
-        <w:t>Self</w:t>
+          <w:bCs w:val="0"/>
+        </w:rPr>
+        <w:t>A</w:t>
+      </w:r>
+      <w:r>
+        <w:t xml:space="preserve"> </w:t>
+      </w:r>
+      <w:r>
+        <w:rPr>
+          <w:b w:val="0"/>
+          <w:bCs w:val="0"/>
+          <w:sz w:val="22"/>
+          <w:szCs w:val="22"/>
+        </w:rPr>
+        <w:t>project which addresses all the problems related to calendar and clock</w:t>
+      </w:r>
+      <w:r>
+        <w:rPr>
+          <w:sz w:val="22"/>
+          <w:szCs w:val="22"/>
+        </w:rPr>
+        <w:t>.</w:t>
       </w:r>
     </w:p>
     <w:p>
@@ -2467,29 +2669,9 @@
         <w:pStyle w:val="ListParagraph"/>
         <w:numPr>
           <w:ilvl w:val="0"/>
-          <w:numId w:val="7"/>
+          <w:numId w:val="14"/>
         </w:numPr>
       </w:pPr>
-      <w:r>
-        <w:t>A project which addresses all the problems related to calendar and clock.</w:t>
-      </w:r>
-    </w:p>
-    <w:p>
-      <w:pPr>
-        <w:rPr>
-          <w:b/>
-          <w:bCs/>
-          <w:color w:val="1F497D" w:themeColor="text2"/>
-          <w:sz w:val="20"/>
-          <w:szCs w:val="20"/>
-        </w:rPr>
-      </w:pPr>
-      <w:r>
-        <w:rPr>
-          <w:color w:val="1F497D" w:themeColor="text2"/>
-        </w:rPr>
-        <w:t xml:space="preserve">  </w:t>
-      </w:r>
       <w:hyperlink r:id="rId12" w:history="1">
         <w:r>
           <w:rPr>
@@ -2503,17 +2685,34 @@
           <w:t>CPU-GPU Selector</w:t>
         </w:r>
       </w:hyperlink>
+      <w:r>
+        <w:rPr>
+          <w:b/>
+          <w:bCs/>
+          <w:color w:val="1F497D" w:themeColor="text2"/>
+          <w:sz w:val="20"/>
+          <w:szCs w:val="20"/>
+        </w:rPr>
+        <w:t xml:space="preserve"> :</w:t>
+      </w:r>
+      <w:r>
+        <w:t>Implemented a system that decides the model training to be done on CPU, GPU,</w:t>
+      </w:r>
     </w:p>
     <w:p>
       <w:pPr>
         <w:pStyle w:val="ListParagraph"/>
-        <w:numPr>
-          <w:ilvl w:val="0"/>
-          <w:numId w:val="7"/>
-        </w:numPr>
-      </w:pPr>
-      <w:r>
-        <w:t>Implemented a system that decides the model training to be done on CPU, GPU, or GPU on cloud.</w:t>
+        <w:ind w:left="720" w:firstLine="0"/>
+        <w:rPr>
+          <w:b/>
+          <w:bCs/>
+          <w:color w:val="1F497D" w:themeColor="text2"/>
+          <w:sz w:val="20"/>
+          <w:szCs w:val="20"/>
+        </w:rPr>
+      </w:pPr>
+      <w:r>
+        <w:t>or GPU on cloud.</w:t>
       </w:r>
     </w:p>
     <w:p>
@@ -2586,28 +2785,14 @@
           <w:sz w:val="24"/>
           <w:szCs w:val="26"/>
         </w:rPr>
-        <w:t>Programming language</w:t>
+        <w:t>Microcontrollers</w:t>
       </w:r>
       <w:r>
         <w:rPr>
           <w:color w:val="000000"/>
           <w:szCs w:val="26"/>
         </w:rPr>
-        <w:t xml:space="preserve">:  </w:t>
-      </w:r>
-      <w:r>
-        <w:rPr>
-          <w:color w:val="000000"/>
-          <w:szCs w:val="26"/>
-        </w:rPr>
-        <w:t xml:space="preserve">Proficient in </w:t>
-      </w:r>
-      <w:r>
-        <w:rPr>
-          <w:color w:val="000000"/>
-          <w:szCs w:val="26"/>
-        </w:rPr>
-        <w:t>Embedded C, C++</w:t>
+        <w:t>: ARM Cortex M3 LPC1768, ESP8266</w:t>
       </w:r>
     </w:p>
     <w:p>
@@ -2637,14 +2822,14 @@
           <w:sz w:val="24"/>
           <w:szCs w:val="26"/>
         </w:rPr>
-        <w:t>Microcontrollers</w:t>
+        <w:t>Protocols</w:t>
       </w:r>
       <w:r>
         <w:rPr>
           <w:color w:val="000000"/>
           <w:szCs w:val="26"/>
         </w:rPr>
-        <w:t>: ARM Cortex M3 LPC1768, ESP8266</w:t>
+        <w:t>: UART, I2C, SPI, CAN</w:t>
       </w:r>
     </w:p>
     <w:p>
@@ -2674,15 +2859,31 @@
           <w:sz w:val="24"/>
           <w:szCs w:val="26"/>
         </w:rPr>
-        <w:t>Protocols</w:t>
+        <w:t>Design</w:t>
       </w:r>
       <w:r>
         <w:rPr>
           <w:color w:val="000000"/>
           <w:szCs w:val="26"/>
         </w:rPr>
-        <w:t>: UART, I2C, SPI, CAN</w:t>
-      </w:r>
+        <w:t>: Enterprise Architecture</w:t>
+      </w:r>
+      <w:r>
+        <w:rPr>
+          <w:color w:val="000000"/>
+          <w:szCs w:val="26"/>
+        </w:rPr>
+        <w:t xml:space="preserve">, </w:t>
+      </w:r>
+      <w:proofErr w:type="spellStart"/>
+      <w:r>
+        <w:rPr>
+          <w:color w:val="000000"/>
+          <w:szCs w:val="26"/>
+        </w:rPr>
+        <w:t>PlantUML</w:t>
+      </w:r>
+      <w:proofErr w:type="spellEnd"/>
     </w:p>
     <w:p>
       <w:pPr>
@@ -2711,22 +2912,37 @@
           <w:sz w:val="24"/>
           <w:szCs w:val="26"/>
         </w:rPr>
-        <w:t>Programming IDE</w:t>
-      </w:r>
-      <w:r>
-        <w:rPr>
-          <w:color w:val="000000"/>
-          <w:sz w:val="24"/>
-          <w:szCs w:val="26"/>
-        </w:rPr>
-        <w:t>:</w:t>
+        <w:t>Debugger</w:t>
       </w:r>
       <w:r>
         <w:rPr>
           <w:color w:val="000000"/>
           <w:szCs w:val="26"/>
         </w:rPr>
-        <w:t xml:space="preserve"> Visual Studio Code, VS Professional, Eclipse IDE</w:t>
+        <w:t xml:space="preserve">: </w:t>
+      </w:r>
+      <w:proofErr w:type="spellStart"/>
+      <w:r>
+        <w:rPr>
+          <w:color w:val="000000"/>
+          <w:szCs w:val="26"/>
+        </w:rPr>
+        <w:t>Valgrind</w:t>
+      </w:r>
+      <w:proofErr w:type="spellEnd"/>
+      <w:r>
+        <w:rPr>
+          <w:color w:val="000000"/>
+          <w:szCs w:val="26"/>
+        </w:rPr>
+        <w:t xml:space="preserve">, GDB, </w:t>
+      </w:r>
+      <w:r>
+        <w:rPr>
+          <w:color w:val="000000"/>
+          <w:szCs w:val="26"/>
+        </w:rPr>
+        <w:t>Lauterbach Trace32</w:t>
       </w:r>
     </w:p>
     <w:p>
@@ -2756,15 +2972,24 @@
           <w:sz w:val="24"/>
           <w:szCs w:val="26"/>
         </w:rPr>
-        <w:t>Requirement Software</w:t>
+        <w:t>Automotive testing tools</w:t>
       </w:r>
       <w:r>
         <w:rPr>
           <w:color w:val="000000"/>
           <w:szCs w:val="26"/>
         </w:rPr>
-        <w:t>: IBM Rational DOORS</w:t>
-      </w:r>
+        <w:t xml:space="preserve">: </w:t>
+      </w:r>
+      <w:proofErr w:type="spellStart"/>
+      <w:r>
+        <w:rPr>
+          <w:color w:val="000000"/>
+          <w:szCs w:val="26"/>
+        </w:rPr>
+        <w:t>CANoe</w:t>
+      </w:r>
+      <w:proofErr w:type="spellEnd"/>
     </w:p>
     <w:p>
       <w:pPr>
@@ -2793,31 +3018,22 @@
           <w:sz w:val="24"/>
           <w:szCs w:val="26"/>
         </w:rPr>
-        <w:t>Design</w:t>
+        <w:t>Project Manager</w:t>
       </w:r>
       <w:r>
         <w:rPr>
           <w:color w:val="000000"/>
           <w:szCs w:val="26"/>
         </w:rPr>
-        <w:t>: Enterprise Architecture</w:t>
+        <w:t>: Gerrit</w:t>
       </w:r>
       <w:r>
         <w:rPr>
           <w:color w:val="000000"/>
           <w:szCs w:val="26"/>
         </w:rPr>
-        <w:t xml:space="preserve">, </w:t>
-      </w:r>
-      <w:proofErr w:type="spellStart"/>
-      <w:r>
-        <w:rPr>
-          <w:color w:val="000000"/>
-          <w:szCs w:val="26"/>
-        </w:rPr>
-        <w:t>PlantUML</w:t>
-      </w:r>
-      <w:proofErr w:type="spellEnd"/>
+        <w:t>, JIRA</w:t>
+      </w:r>
     </w:p>
     <w:p>
       <w:pPr>
@@ -2846,7 +3062,7 @@
           <w:sz w:val="24"/>
           <w:szCs w:val="26"/>
         </w:rPr>
-        <w:t>Debugger</w:t>
+        <w:t>Unit Testing</w:t>
       </w:r>
       <w:r>
         <w:rPr>
@@ -2861,166 +3077,9 @@
           <w:color w:val="000000"/>
           <w:szCs w:val="26"/>
         </w:rPr>
-        <w:t>Valgrind</w:t>
+        <w:t>Gtest</w:t>
       </w:r>
       <w:proofErr w:type="spellEnd"/>
-      <w:r>
-        <w:rPr>
-          <w:color w:val="000000"/>
-          <w:szCs w:val="26"/>
-        </w:rPr>
-        <w:t xml:space="preserve">, GDB, </w:t>
-      </w:r>
-      <w:r>
-        <w:rPr>
-          <w:color w:val="000000"/>
-          <w:szCs w:val="26"/>
-        </w:rPr>
-        <w:t>Lauterbach Trace32</w:t>
-      </w:r>
-    </w:p>
-    <w:p>
-      <w:pPr>
-        <w:pStyle w:val="ListParagraph"/>
-        <w:numPr>
-          <w:ilvl w:val="0"/>
-          <w:numId w:val="12"/>
-        </w:numPr>
-        <w:pBdr>
-          <w:top w:val="none" w:sz="4" w:space="0" w:color="auto"/>
-          <w:left w:val="none" w:sz="4" w:space="0" w:color="auto"/>
-          <w:bottom w:val="none" w:sz="4" w:space="0" w:color="auto"/>
-          <w:right w:val="none" w:sz="4" w:space="0" w:color="auto"/>
-          <w:between w:val="none" w:sz="4" w:space="0" w:color="auto"/>
-          <w:bar w:val="none" w:sz="4" w:color="auto"/>
-        </w:pBdr>
-        <w:rPr>
-          <w:color w:val="000000"/>
-          <w:szCs w:val="26"/>
-        </w:rPr>
-      </w:pPr>
-      <w:r>
-        <w:rPr>
-          <w:b/>
-          <w:color w:val="000000"/>
-          <w:sz w:val="24"/>
-          <w:szCs w:val="26"/>
-        </w:rPr>
-        <w:t>Automotive testing tools</w:t>
-      </w:r>
-      <w:r>
-        <w:rPr>
-          <w:color w:val="000000"/>
-          <w:szCs w:val="26"/>
-        </w:rPr>
-        <w:t xml:space="preserve">: </w:t>
-      </w:r>
-      <w:proofErr w:type="spellStart"/>
-      <w:r>
-        <w:rPr>
-          <w:color w:val="000000"/>
-          <w:szCs w:val="26"/>
-        </w:rPr>
-        <w:t>CANoe</w:t>
-      </w:r>
-      <w:proofErr w:type="spellEnd"/>
-    </w:p>
-    <w:p>
-      <w:pPr>
-        <w:pStyle w:val="ListParagraph"/>
-        <w:numPr>
-          <w:ilvl w:val="0"/>
-          <w:numId w:val="12"/>
-        </w:numPr>
-        <w:pBdr>
-          <w:top w:val="none" w:sz="4" w:space="0" w:color="auto"/>
-          <w:left w:val="none" w:sz="4" w:space="0" w:color="auto"/>
-          <w:bottom w:val="none" w:sz="4" w:space="0" w:color="auto"/>
-          <w:right w:val="none" w:sz="4" w:space="0" w:color="auto"/>
-          <w:between w:val="none" w:sz="4" w:space="0" w:color="auto"/>
-          <w:bar w:val="none" w:sz="4" w:color="auto"/>
-        </w:pBdr>
-        <w:rPr>
-          <w:color w:val="000000"/>
-          <w:szCs w:val="26"/>
-        </w:rPr>
-      </w:pPr>
-      <w:r>
-        <w:rPr>
-          <w:b/>
-          <w:color w:val="000000"/>
-          <w:sz w:val="24"/>
-          <w:szCs w:val="26"/>
-        </w:rPr>
-        <w:t>Project Manager</w:t>
-      </w:r>
-      <w:r>
-        <w:rPr>
-          <w:color w:val="000000"/>
-          <w:szCs w:val="26"/>
-        </w:rPr>
-        <w:t>: Gerrit, RTC workflow manager</w:t>
-      </w:r>
-      <w:r>
-        <w:rPr>
-          <w:color w:val="000000"/>
-          <w:szCs w:val="26"/>
-        </w:rPr>
-        <w:t>, JIRA</w:t>
-      </w:r>
-    </w:p>
-    <w:p>
-      <w:pPr>
-        <w:pStyle w:val="ListParagraph"/>
-        <w:numPr>
-          <w:ilvl w:val="0"/>
-          <w:numId w:val="12"/>
-        </w:numPr>
-        <w:pBdr>
-          <w:top w:val="none" w:sz="4" w:space="0" w:color="auto"/>
-          <w:left w:val="none" w:sz="4" w:space="0" w:color="auto"/>
-          <w:bottom w:val="none" w:sz="4" w:space="0" w:color="auto"/>
-          <w:right w:val="none" w:sz="4" w:space="0" w:color="auto"/>
-          <w:between w:val="none" w:sz="4" w:space="0" w:color="auto"/>
-          <w:bar w:val="none" w:sz="4" w:color="auto"/>
-        </w:pBdr>
-        <w:rPr>
-          <w:color w:val="000000"/>
-          <w:szCs w:val="26"/>
-        </w:rPr>
-      </w:pPr>
-      <w:r>
-        <w:rPr>
-          <w:b/>
-          <w:color w:val="000000"/>
-          <w:sz w:val="24"/>
-          <w:szCs w:val="26"/>
-        </w:rPr>
-        <w:t>Unit Testing</w:t>
-      </w:r>
-      <w:r>
-        <w:rPr>
-          <w:color w:val="000000"/>
-          <w:szCs w:val="26"/>
-        </w:rPr>
-        <w:t xml:space="preserve">: </w:t>
-      </w:r>
-      <w:proofErr w:type="spellStart"/>
-      <w:r>
-        <w:rPr>
-          <w:color w:val="000000"/>
-          <w:szCs w:val="26"/>
-        </w:rPr>
-        <w:t>Gtest</w:t>
-      </w:r>
-      <w:proofErr w:type="spellEnd"/>
-      <w:r>
-        <w:rPr>
-          <w:color w:val="000000"/>
-          <w:szCs w:val="26"/>
-        </w:rPr>
-        <w:t>, Excel UT automation</w:t>
-      </w:r>
       <w:r>
         <w:rPr>
           <w:color w:val="000000"/>
@@ -3108,7 +3167,7 @@
           <w:sz w:val="24"/>
           <w:szCs w:val="22"/>
         </w:rPr>
-        <w:t>OS</w:t>
+        <w:t>Build</w:t>
       </w:r>
       <w:r>
         <w:rPr>
@@ -3124,7 +3183,151 @@
           <w:sz w:val="22"/>
           <w:szCs w:val="22"/>
         </w:rPr>
+        <w:t xml:space="preserve"> </w:t>
+      </w:r>
+      <w:proofErr w:type="spellStart"/>
+      <w:r>
+        <w:rPr>
+          <w:color w:val="000000"/>
+          <w:sz w:val="22"/>
+          <w:szCs w:val="22"/>
+        </w:rPr>
+        <w:t>Cmake</w:t>
+      </w:r>
+      <w:proofErr w:type="spellEnd"/>
+      <w:r>
+        <w:rPr>
+          <w:color w:val="000000"/>
+          <w:sz w:val="22"/>
+          <w:szCs w:val="22"/>
+        </w:rPr>
+        <w:t xml:space="preserve">, </w:t>
+      </w:r>
+      <w:proofErr w:type="spellStart"/>
+      <w:r>
+        <w:rPr>
+          <w:color w:val="000000"/>
+          <w:sz w:val="22"/>
+          <w:szCs w:val="22"/>
+        </w:rPr>
+        <w:t>Sconscript</w:t>
+      </w:r>
+      <w:proofErr w:type="spellEnd"/>
+      <w:r>
+        <w:rPr>
+          <w:color w:val="000000"/>
+          <w:sz w:val="22"/>
+          <w:szCs w:val="22"/>
+        </w:rPr>
+        <w:t xml:space="preserve">, </w:t>
+      </w:r>
+      <w:proofErr w:type="spellStart"/>
+      <w:r>
+        <w:rPr>
+          <w:color w:val="000000"/>
+          <w:sz w:val="22"/>
+          <w:szCs w:val="22"/>
+        </w:rPr>
+        <w:t>makefile</w:t>
+      </w:r>
+      <w:proofErr w:type="spellEnd"/>
+    </w:p>
+    <w:p>
+      <w:pPr>
+        <w:pStyle w:val="BodyText"/>
+        <w:numPr>
+          <w:ilvl w:val="0"/>
+          <w:numId w:val="12"/>
+        </w:numPr>
+        <w:tabs>
+          <w:tab w:val="left" w:pos="2462"/>
+        </w:tabs>
+        <w:spacing w:before="71" w:line="184" w:lineRule="auto"/>
+        <w:ind w:right="1"/>
+        <w:rPr>
+          <w:color w:val="000000"/>
+          <w:sz w:val="22"/>
+          <w:szCs w:val="22"/>
+        </w:rPr>
+      </w:pPr>
+      <w:r>
+        <w:rPr>
+          <w:b/>
+          <w:color w:val="000000"/>
+          <w:sz w:val="24"/>
+          <w:szCs w:val="22"/>
+        </w:rPr>
+        <w:t>OS</w:t>
+      </w:r>
+      <w:r>
+        <w:rPr>
+          <w:color w:val="000000"/>
+          <w:sz w:val="22"/>
+          <w:szCs w:val="22"/>
+        </w:rPr>
+        <w:t>:</w:t>
+      </w:r>
+      <w:r>
+        <w:rPr>
+          <w:color w:val="000000"/>
+          <w:sz w:val="22"/>
+          <w:szCs w:val="22"/>
+        </w:rPr>
         <w:t xml:space="preserve"> Ubuntu</w:t>
+      </w:r>
+    </w:p>
+    <w:p>
+      <w:pPr>
+        <w:pStyle w:val="BodyText"/>
+        <w:numPr>
+          <w:ilvl w:val="0"/>
+          <w:numId w:val="12"/>
+        </w:numPr>
+        <w:tabs>
+          <w:tab w:val="left" w:pos="2462"/>
+        </w:tabs>
+        <w:spacing w:before="71" w:line="184" w:lineRule="auto"/>
+        <w:ind w:right="1"/>
+        <w:rPr>
+          <w:color w:val="000000"/>
+          <w:sz w:val="22"/>
+          <w:szCs w:val="22"/>
+        </w:rPr>
+      </w:pPr>
+      <w:r>
+        <w:rPr>
+          <w:b/>
+          <w:color w:val="000000"/>
+          <w:sz w:val="24"/>
+          <w:szCs w:val="22"/>
+        </w:rPr>
+        <w:t>AI tools:</w:t>
+      </w:r>
+      <w:r>
+        <w:rPr>
+          <w:color w:val="000000"/>
+          <w:sz w:val="22"/>
+          <w:szCs w:val="22"/>
+        </w:rPr>
+        <w:t xml:space="preserve"> </w:t>
+      </w:r>
+      <w:proofErr w:type="spellStart"/>
+      <w:r>
+        <w:rPr>
+          <w:color w:val="000000"/>
+          <w:sz w:val="22"/>
+          <w:szCs w:val="22"/>
+        </w:rPr>
+        <w:t>Github</w:t>
+      </w:r>
+      <w:proofErr w:type="spellEnd"/>
+      <w:r>
+        <w:rPr>
+          <w:color w:val="000000"/>
+          <w:sz w:val="22"/>
+          <w:szCs w:val="22"/>
+        </w:rPr>
+        <w:t xml:space="preserve"> Copilot, Perplexity, Google AI studio</w:t>
       </w:r>
     </w:p>
     <w:p/>
@@ -3300,12 +3503,16 @@
         <w:pStyle w:val="ListParagraph"/>
         <w:spacing w:line="276" w:lineRule="auto"/>
         <w:ind w:left="833" w:firstLine="0"/>
-      </w:pPr>
-      <w:r>
         <w:rPr>
           <w:color w:val="414141"/>
           <w:w w:val="110"/>
         </w:rPr>
+      </w:pPr>
+      <w:r>
+        <w:rPr>
+          <w:color w:val="414141"/>
+          <w:w w:val="110"/>
+        </w:rPr>
         <w:t>Move Semantics,</w:t>
       </w:r>
       <w:r>
@@ -3335,6 +3542,47 @@
           <w:w w:val="110"/>
         </w:rPr>
         <w:t>.</w:t>
+      </w:r>
+    </w:p>
+    <w:p>
+      <w:pPr>
+        <w:pStyle w:val="ListParagraph"/>
+        <w:numPr>
+          <w:ilvl w:val="0"/>
+          <w:numId w:val="11"/>
+        </w:numPr>
+        <w:spacing w:line="276" w:lineRule="auto"/>
+        <w:rPr>
+          <w:b/>
+          <w:bCs/>
+          <w:sz w:val="24"/>
+          <w:szCs w:val="24"/>
+        </w:rPr>
+      </w:pPr>
+      <w:r>
+        <w:rPr>
+          <w:b/>
+          <w:bCs/>
+          <w:color w:val="414141"/>
+          <w:w w:val="110"/>
+          <w:sz w:val="24"/>
+          <w:szCs w:val="24"/>
+        </w:rPr>
+        <w:t>AI Integration</w:t>
+      </w:r>
+    </w:p>
+    <w:p>
+      <w:pPr>
+        <w:pStyle w:val="ListParagraph"/>
+        <w:spacing w:line="276" w:lineRule="auto"/>
+        <w:ind w:left="833" w:firstLine="0"/>
+      </w:pPr>
+      <w:r>
+        <w:rPr>
+          <w:color w:val="414141"/>
+          <w:w w:val="110"/>
+        </w:rPr>
+        <w:t>Synthetic dataset generation, Local LLM integration</w:t>
       </w:r>
     </w:p>
     <w:p/>
@@ -4708,6 +4956,268 @@
     </w:lvl>
   </w:abstractNum>
   <w:abstractNum w:abstractNumId="6" w15:restartNumberingAfterBreak="0">
+    <w:nsid w:val="36593087"/>
+    <w:multiLevelType w:val="hybridMultilevel"/>
+    <w:tmpl w:val="D4CC2EBA"/>
+    <w:lvl w:ilvl="0" w:tplc="40090001">
+      <w:start w:val="1"/>
+      <w:numFmt w:val="bullet"/>
+      <w:lvlText w:val=""/>
+      <w:lvlJc w:val="left"/>
+      <w:pPr>
+        <w:ind w:left="720" w:hanging="360"/>
+      </w:pPr>
+      <w:rPr>
+        <w:rFonts w:ascii="Symbol" w:hAnsi="Symbol" w:hint="default"/>
+      </w:rPr>
+    </w:lvl>
+    <w:lvl w:ilvl="1" w:tplc="40090003" w:tentative="1">
+      <w:start w:val="1"/>
+      <w:numFmt w:val="bullet"/>
+      <w:lvlText w:val="o"/>
+      <w:lvlJc w:val="left"/>
+      <w:pPr>
+        <w:ind w:left="1440" w:hanging="360"/>
+      </w:pPr>
+      <w:rPr>
+        <w:rFonts w:ascii="Courier New" w:hAnsi="Courier New" w:cs="Courier New" w:hint="default"/>
+      </w:rPr>
+    </w:lvl>
+    <w:lvl w:ilvl="2" w:tplc="40090005" w:tentative="1">
+      <w:start w:val="1"/>
+      <w:numFmt w:val="bullet"/>
+      <w:lvlText w:val=""/>
+      <w:lvlJc w:val="left"/>
+      <w:pPr>
+        <w:ind w:left="2160" w:hanging="360"/>
+      </w:pPr>
+      <w:rPr>
+        <w:rFonts w:ascii="Wingdings" w:hAnsi="Wingdings" w:hint="default"/>
+      </w:rPr>
+    </w:lvl>
+    <w:lvl w:ilvl="3" w:tplc="40090001" w:tentative="1">
+      <w:start w:val="1"/>
+      <w:numFmt w:val="bullet"/>
+      <w:lvlText w:val=""/>
+      <w:lvlJc w:val="left"/>
+      <w:pPr>
+        <w:ind w:left="2880" w:hanging="360"/>
+      </w:pPr>
+      <w:rPr>
+        <w:rFonts w:ascii="Symbol" w:hAnsi="Symbol" w:hint="default"/>
+      </w:rPr>
+    </w:lvl>
+    <w:lvl w:ilvl="4" w:tplc="40090003" w:tentative="1">
+      <w:start w:val="1"/>
+      <w:numFmt w:val="bullet"/>
+      <w:lvlText w:val="o"/>
+      <w:lvlJc w:val="left"/>
+      <w:pPr>
+        <w:ind w:left="3600" w:hanging="360"/>
+      </w:pPr>
+      <w:rPr>
+        <w:rFonts w:ascii="Courier New" w:hAnsi="Courier New" w:cs="Courier New" w:hint="default"/>
+      </w:rPr>
+    </w:lvl>
+    <w:lvl w:ilvl="5" w:tplc="40090005" w:tentative="1">
+      <w:start w:val="1"/>
+      <w:numFmt w:val="bullet"/>
+      <w:lvlText w:val=""/>
+      <w:lvlJc w:val="left"/>
+      <w:pPr>
+        <w:ind w:left="4320" w:hanging="360"/>
+      </w:pPr>
+      <w:rPr>
+        <w:rFonts w:ascii="Wingdings" w:hAnsi="Wingdings" w:hint="default"/>
+      </w:rPr>
+    </w:lvl>
+    <w:lvl w:ilvl="6" w:tplc="40090001" w:tentative="1">
+      <w:start w:val="1"/>
+      <w:numFmt w:val="bullet"/>
+      <w:lvlText w:val=""/>
+      <w:lvlJc w:val="left"/>
+      <w:pPr>
+        <w:ind w:left="5040" w:hanging="360"/>
+      </w:pPr>
+      <w:rPr>
+        <w:rFonts w:ascii="Symbol" w:hAnsi="Symbol" w:hint="default"/>
+      </w:rPr>
+    </w:lvl>
+    <w:lvl w:ilvl="7" w:tplc="40090003" w:tentative="1">
+      <w:start w:val="1"/>
+      <w:numFmt w:val="bullet"/>
+      <w:lvlText w:val="o"/>
+      <w:lvlJc w:val="left"/>
+      <w:pPr>
+        <w:ind w:left="5760" w:hanging="360"/>
+      </w:pPr>
+      <w:rPr>
+        <w:rFonts w:ascii="Courier New" w:hAnsi="Courier New" w:cs="Courier New" w:hint="default"/>
+      </w:rPr>
+    </w:lvl>
+    <w:lvl w:ilvl="8" w:tplc="40090005" w:tentative="1">
+      <w:start w:val="1"/>
+      <w:numFmt w:val="bullet"/>
+      <w:lvlText w:val=""/>
+      <w:lvlJc w:val="left"/>
+      <w:pPr>
+        <w:ind w:left="6480" w:hanging="360"/>
+      </w:pPr>
+      <w:rPr>
+        <w:rFonts w:ascii="Wingdings" w:hAnsi="Wingdings" w:hint="default"/>
+      </w:rPr>
+    </w:lvl>
+  </w:abstractNum>
+  <w:abstractNum w:abstractNumId="7" w15:restartNumberingAfterBreak="0">
+    <w:nsid w:val="3ED652F7"/>
+    <w:multiLevelType w:val="multilevel"/>
+    <w:tmpl w:val="183060E0"/>
+    <w:lvl w:ilvl="0">
+      <w:start w:val="1"/>
+      <w:numFmt w:val="bullet"/>
+      <w:lvlText w:val=""/>
+      <w:lvlJc w:val="left"/>
+      <w:pPr>
+        <w:tabs>
+          <w:tab w:val="num" w:pos="720"/>
+        </w:tabs>
+        <w:ind w:left="720" w:hanging="360"/>
+      </w:pPr>
+      <w:rPr>
+        <w:rFonts w:ascii="Symbol" w:hAnsi="Symbol" w:hint="default"/>
+        <w:sz w:val="20"/>
+      </w:rPr>
+    </w:lvl>
+    <w:lvl w:ilvl="1" w:tentative="1">
+      <w:start w:val="1"/>
+      <w:numFmt w:val="bullet"/>
+      <w:lvlText w:val=""/>
+      <w:lvlJc w:val="left"/>
+      <w:pPr>
+        <w:tabs>
+          <w:tab w:val="num" w:pos="1440"/>
+        </w:tabs>
+        <w:ind w:left="1440" w:hanging="360"/>
+      </w:pPr>
+      <w:rPr>
+        <w:rFonts w:ascii="Symbol" w:hAnsi="Symbol" w:hint="default"/>
+        <w:sz w:val="20"/>
+      </w:rPr>
+    </w:lvl>
+    <w:lvl w:ilvl="2" w:tentative="1">
+      <w:start w:val="1"/>
+      <w:numFmt w:val="bullet"/>
+      <w:lvlText w:val=""/>
+      <w:lvlJc w:val="left"/>
+      <w:pPr>
+        <w:tabs>
+          <w:tab w:val="num" w:pos="2160"/>
+        </w:tabs>
+        <w:ind w:left="2160" w:hanging="360"/>
+      </w:pPr>
+      <w:rPr>
+        <w:rFonts w:ascii="Symbol" w:hAnsi="Symbol" w:hint="default"/>
+        <w:sz w:val="20"/>
+      </w:rPr>
+    </w:lvl>
+    <w:lvl w:ilvl="3" w:tentative="1">
+      <w:start w:val="1"/>
+      <w:numFmt w:val="bullet"/>
+      <w:lvlText w:val=""/>
+      <w:lvlJc w:val="left"/>
+      <w:pPr>
+        <w:tabs>
+          <w:tab w:val="num" w:pos="2880"/>
+        </w:tabs>
+        <w:ind w:left="2880" w:hanging="360"/>
+      </w:pPr>
+      <w:rPr>
+        <w:rFonts w:ascii="Symbol" w:hAnsi="Symbol" w:hint="default"/>
+        <w:sz w:val="20"/>
+      </w:rPr>
+    </w:lvl>
+    <w:lvl w:ilvl="4" w:tentative="1">
+      <w:start w:val="1"/>
+      <w:numFmt w:val="bullet"/>
+      <w:lvlText w:val=""/>
+      <w:lvlJc w:val="left"/>
+      <w:pPr>
+        <w:tabs>
+          <w:tab w:val="num" w:pos="3600"/>
+        </w:tabs>
+        <w:ind w:left="3600" w:hanging="360"/>
+      </w:pPr>
+      <w:rPr>
+        <w:rFonts w:ascii="Symbol" w:hAnsi="Symbol" w:hint="default"/>
+        <w:sz w:val="20"/>
+      </w:rPr>
+    </w:lvl>
+    <w:lvl w:ilvl="5" w:tentative="1">
+      <w:start w:val="1"/>
+      <w:numFmt w:val="bullet"/>
+      <w:lvlText w:val=""/>
+      <w:lvlJc w:val="left"/>
+      <w:pPr>
+        <w:tabs>
+          <w:tab w:val="num" w:pos="4320"/>
+        </w:tabs>
+        <w:ind w:left="4320" w:hanging="360"/>
+      </w:pPr>
+      <w:rPr>
+        <w:rFonts w:ascii="Symbol" w:hAnsi="Symbol" w:hint="default"/>
+        <w:sz w:val="20"/>
+      </w:rPr>
+    </w:lvl>
+    <w:lvl w:ilvl="6" w:tentative="1">
+      <w:start w:val="1"/>
+      <w:numFmt w:val="bullet"/>
+      <w:lvlText w:val=""/>
+      <w:lvlJc w:val="left"/>
+      <w:pPr>
+        <w:tabs>
+          <w:tab w:val="num" w:pos="5040"/>
+        </w:tabs>
+        <w:ind w:left="5040" w:hanging="360"/>
+      </w:pPr>
+      <w:rPr>
+        <w:rFonts w:ascii="Symbol" w:hAnsi="Symbol" w:hint="default"/>
+        <w:sz w:val="20"/>
+      </w:rPr>
+    </w:lvl>
+    <w:lvl w:ilvl="7" w:tentative="1">
+      <w:start w:val="1"/>
+      <w:numFmt w:val="bullet"/>
+      <w:lvlText w:val=""/>
+      <w:lvlJc w:val="left"/>
+      <w:pPr>
+        <w:tabs>
+          <w:tab w:val="num" w:pos="5760"/>
+        </w:tabs>
+        <w:ind w:left="5760" w:hanging="360"/>
+      </w:pPr>
+      <w:rPr>
+        <w:rFonts w:ascii="Symbol" w:hAnsi="Symbol" w:hint="default"/>
+        <w:sz w:val="20"/>
+      </w:rPr>
+    </w:lvl>
+    <w:lvl w:ilvl="8" w:tentative="1">
+      <w:start w:val="1"/>
+      <w:numFmt w:val="bullet"/>
+      <w:lvlText w:val=""/>
+      <w:lvlJc w:val="left"/>
+      <w:pPr>
+        <w:tabs>
+          <w:tab w:val="num" w:pos="6480"/>
+        </w:tabs>
+        <w:ind w:left="6480" w:hanging="360"/>
+      </w:pPr>
+      <w:rPr>
+        <w:rFonts w:ascii="Symbol" w:hAnsi="Symbol" w:hint="default"/>
+        <w:sz w:val="20"/>
+      </w:rPr>
+    </w:lvl>
+  </w:abstractNum>
+  <w:abstractNum w:abstractNumId="8" w15:restartNumberingAfterBreak="0">
     <w:nsid w:val="52107CDB"/>
     <w:multiLevelType w:val="hybridMultilevel"/>
     <w:tmpl w:val="4D96F610"/>
@@ -4820,7 +5330,7 @@
       </w:rPr>
     </w:lvl>
   </w:abstractNum>
-  <w:abstractNum w:abstractNumId="7" w15:restartNumberingAfterBreak="0">
+  <w:abstractNum w:abstractNumId="9" w15:restartNumberingAfterBreak="0">
     <w:nsid w:val="53DC72F8"/>
     <w:multiLevelType w:val="hybridMultilevel"/>
     <w:tmpl w:val="D1DEB5A0"/>
@@ -4934,7 +5444,7 @@
       </w:rPr>
     </w:lvl>
   </w:abstractNum>
-  <w:abstractNum w:abstractNumId="8" w15:restartNumberingAfterBreak="0">
+  <w:abstractNum w:abstractNumId="10" w15:restartNumberingAfterBreak="0">
     <w:nsid w:val="699378BD"/>
     <w:multiLevelType w:val="hybridMultilevel"/>
     <w:tmpl w:val="5592366C"/>
@@ -5047,7 +5557,7 @@
       </w:rPr>
     </w:lvl>
   </w:abstractNum>
-  <w:abstractNum w:abstractNumId="9" w15:restartNumberingAfterBreak="0">
+  <w:abstractNum w:abstractNumId="11" w15:restartNumberingAfterBreak="0">
     <w:nsid w:val="6F8B65F3"/>
     <w:multiLevelType w:val="hybridMultilevel"/>
     <w:tmpl w:val="CDAE044E"/>
@@ -5160,7 +5670,7 @@
       </w:rPr>
     </w:lvl>
   </w:abstractNum>
-  <w:abstractNum w:abstractNumId="10" w15:restartNumberingAfterBreak="0">
+  <w:abstractNum w:abstractNumId="12" w15:restartNumberingAfterBreak="0">
     <w:nsid w:val="713673C4"/>
     <w:multiLevelType w:val="hybridMultilevel"/>
     <w:tmpl w:val="13CCD532"/>
@@ -5273,7 +5783,7 @@
       </w:rPr>
     </w:lvl>
   </w:abstractNum>
-  <w:abstractNum w:abstractNumId="11" w15:restartNumberingAfterBreak="0">
+  <w:abstractNum w:abstractNumId="13" w15:restartNumberingAfterBreak="0">
     <w:nsid w:val="7F955328"/>
     <w:multiLevelType w:val="hybridMultilevel"/>
     <w:tmpl w:val="B7A6D8DA"/>
@@ -5387,10 +5897,10 @@
     </w:lvl>
   </w:abstractNum>
   <w:num w:numId="1" w16cid:durableId="1819764795">
-    <w:abstractNumId w:val="7"/>
+    <w:abstractNumId w:val="9"/>
   </w:num>
   <w:num w:numId="2" w16cid:durableId="1015577343">
-    <w:abstractNumId w:val="6"/>
+    <w:abstractNumId w:val="8"/>
   </w:num>
   <w:num w:numId="3" w16cid:durableId="37171779">
     <w:abstractNumId w:val="4"/>
@@ -5405,22 +5915,28 @@
     <w:abstractNumId w:val="0"/>
   </w:num>
   <w:num w:numId="7" w16cid:durableId="978458224">
-    <w:abstractNumId w:val="11"/>
+    <w:abstractNumId w:val="13"/>
   </w:num>
   <w:num w:numId="8" w16cid:durableId="1786851892">
     <w:abstractNumId w:val="2"/>
   </w:num>
   <w:num w:numId="9" w16cid:durableId="1924143344">
-    <w:abstractNumId w:val="9"/>
+    <w:abstractNumId w:val="11"/>
   </w:num>
   <w:num w:numId="10" w16cid:durableId="1466242932">
-    <w:abstractNumId w:val="10"/>
+    <w:abstractNumId w:val="12"/>
   </w:num>
   <w:num w:numId="11" w16cid:durableId="73825292">
     <w:abstractNumId w:val="3"/>
   </w:num>
   <w:num w:numId="12" w16cid:durableId="1133210350">
-    <w:abstractNumId w:val="8"/>
+    <w:abstractNumId w:val="10"/>
+  </w:num>
+  <w:num w:numId="13" w16cid:durableId="1659307288">
+    <w:abstractNumId w:val="7"/>
+  </w:num>
+  <w:num w:numId="14" w16cid:durableId="228004402">
+    <w:abstractNumId w:val="6"/>
   </w:num>
 </w:numbering>
 </file>
@@ -6543,6 +7059,20 @@
       <w:u w:val="single"/>
     </w:rPr>
   </w:style>
+  <w:style w:type="paragraph" w:customStyle="1" w:styleId="my-0">
+    <w:name w:val="my-0"/>
+    <w:basedOn w:val="Normal"/>
+    <w:rsid w:val="00307021"/>
+    <w:pPr>
+      <w:spacing w:before="100" w:beforeAutospacing="1" w:after="100" w:afterAutospacing="1"/>
+    </w:pPr>
+    <w:rPr>
+      <w:rFonts w:ascii="Times New Roman" w:eastAsia="Times New Roman" w:hAnsi="Times New Roman" w:cs="Times New Roman"/>
+      <w:sz w:val="24"/>
+      <w:szCs w:val="24"/>
+      <w:lang w:val="en-IN" w:eastAsia="en-IN"/>
+    </w:rPr>
+  </w:style>
 </w:styles>
 </file>
 

</xml_diff>